<commit_message>
sync dari svn r84348: r84348 | fauzi | 2026-09-04 06:43:19 +0700 (Fri, 04 Sep 2026)
</commit_message>
<xml_diff>
--- a/docs/pos/manual-posting-keuangan/Manual-UAT-Akuntansi-eBisnis.docx
+++ b/docs/pos/manual-posting-keuangan/Manual-UAT-Akuntansi-eBisnis.docx
@@ -395,7 +395,7 @@
     </w:p>
     <w:p>
       <w:r>
-        <w:t>Dokumen ini menggabungkan panduan operasional dan hasil User Acceptance Test (UAT) menu Akuntansi. Seluruh gambar berasal dari render aplikasi eBisnis yang benar-benar terhubung ke server demo; bukan mockup. Data contoh dibuat hanya untuk jurnal manual.</w:t>
+        <w:t>Dokumen ini menggabungkan panduan operasional dan hasil User Acceptance Test (UAT) menu Akuntansi. Seluruh gambar berasal dari render aplikasi eBisnis yang benar-benar terhubung ke server demo; bukan mockup. Data contoh mencakup jurnal manual, saldo awal, penyesuaian, penjualan/kulakan, pembayaran hutang, penerimaan piutang, dan anggaran.</w:t>
       </w:r>
     </w:p>
     <w:tbl>
@@ -562,9 +562,9 @@
         <w:tblLook w:firstColumn="1" w:firstRow="1" w:lastColumn="0" w:lastRow="0" w:noHBand="0" w:noVBand="1" w:val="04A0"/>
       </w:tblPr>
       <w:tblGrid>
-        <w:gridCol w:w="1814"/>
-        <w:gridCol w:w="5329"/>
-        <w:gridCol w:w="2268"/>
+        <w:gridCol w:w="1803"/>
+        <w:gridCol w:w="5297"/>
+        <w:gridCol w:w="2254"/>
       </w:tblGrid>
       <w:tr>
         <w:trPr>
@@ -572,7 +572,7 @@
         </w:trPr>
         <w:tc>
           <w:tcPr>
-            <w:tcW w:type="dxa" w:w="3345"/>
+            <w:tcW w:type="dxa" w:w="1803"/>
             <w:shd w:fill="132238"/>
             <w:vAlign w:val="center"/>
             <w:tcMar>
@@ -600,7 +600,7 @@
         </w:tc>
         <w:tc>
           <w:tcPr>
-            <w:tcW w:type="dxa" w:w="3345"/>
+            <w:tcW w:type="dxa" w:w="5297"/>
             <w:shd w:fill="132238"/>
             <w:vAlign w:val="center"/>
             <w:tcMar>
@@ -628,7 +628,7 @@
         </w:tc>
         <w:tc>
           <w:tcPr>
-            <w:tcW w:type="dxa" w:w="3345"/>
+            <w:tcW w:type="dxa" w:w="2254"/>
             <w:shd w:fill="132238"/>
             <w:vAlign w:val="center"/>
             <w:tcMar>
@@ -658,7 +658,7 @@
       <w:tr>
         <w:tc>
           <w:tcPr>
-            <w:tcW w:type="dxa" w:w="1814"/>
+            <w:tcW w:type="dxa" w:w="1803"/>
             <w:shd w:fill="F3F6FA"/>
             <w:vAlign w:val="center"/>
             <w:tcMar>
@@ -686,7 +686,7 @@
         </w:tc>
         <w:tc>
           <w:tcPr>
-            <w:tcW w:type="dxa" w:w="5329"/>
+            <w:tcW w:type="dxa" w:w="5297"/>
             <w:shd w:fill="F3F6FA"/>
             <w:vAlign w:val="center"/>
             <w:tcMar>
@@ -714,7 +714,7 @@
         </w:tc>
         <w:tc>
           <w:tcPr>
-            <w:tcW w:type="dxa" w:w="2268"/>
+            <w:tcW w:type="dxa" w:w="2254"/>
             <w:shd w:fill="F3F6FA"/>
             <w:vAlign w:val="center"/>
             <w:tcMar>
@@ -744,7 +744,7 @@
       <w:tr>
         <w:tc>
           <w:tcPr>
-            <w:tcW w:type="dxa" w:w="1814"/>
+            <w:tcW w:type="dxa" w:w="1803"/>
             <w:vAlign w:val="center"/>
             <w:tcMar>
               <w:top w:w="80" w:type="dxa"/>
@@ -771,7 +771,7 @@
         </w:tc>
         <w:tc>
           <w:tcPr>
-            <w:tcW w:type="dxa" w:w="5329"/>
+            <w:tcW w:type="dxa" w:w="5297"/>
             <w:vAlign w:val="center"/>
             <w:tcMar>
               <w:top w:w="80" w:type="dxa"/>
@@ -798,7 +798,7 @@
         </w:tc>
         <w:tc>
           <w:tcPr>
-            <w:tcW w:type="dxa" w:w="2268"/>
+            <w:tcW w:type="dxa" w:w="2254"/>
             <w:vAlign w:val="center"/>
             <w:tcMar>
               <w:top w:w="80" w:type="dxa"/>
@@ -827,7 +827,7 @@
       <w:tr>
         <w:tc>
           <w:tcPr>
-            <w:tcW w:type="dxa" w:w="1814"/>
+            <w:tcW w:type="dxa" w:w="1803"/>
             <w:shd w:fill="F3F6FA"/>
             <w:vAlign w:val="center"/>
             <w:tcMar>
@@ -855,7 +855,7 @@
         </w:tc>
         <w:tc>
           <w:tcPr>
-            <w:tcW w:type="dxa" w:w="5329"/>
+            <w:tcW w:type="dxa" w:w="5297"/>
             <w:shd w:fill="F3F6FA"/>
             <w:vAlign w:val="center"/>
             <w:tcMar>
@@ -883,7 +883,7 @@
         </w:tc>
         <w:tc>
           <w:tcPr>
-            <w:tcW w:type="dxa" w:w="2268"/>
+            <w:tcW w:type="dxa" w:w="2254"/>
             <w:shd w:fill="F3F6FA"/>
             <w:vAlign w:val="center"/>
             <w:tcMar>
@@ -913,7 +913,7 @@
       <w:tr>
         <w:tc>
           <w:tcPr>
-            <w:tcW w:type="dxa" w:w="1814"/>
+            <w:tcW w:type="dxa" w:w="1803"/>
             <w:vAlign w:val="center"/>
             <w:tcMar>
               <w:top w:w="80" w:type="dxa"/>
@@ -940,7 +940,7 @@
         </w:tc>
         <w:tc>
           <w:tcPr>
-            <w:tcW w:type="dxa" w:w="5329"/>
+            <w:tcW w:type="dxa" w:w="5297"/>
             <w:vAlign w:val="center"/>
             <w:tcMar>
               <w:top w:w="80" w:type="dxa"/>
@@ -967,7 +967,7 @@
         </w:tc>
         <w:tc>
           <w:tcPr>
-            <w:tcW w:type="dxa" w:w="2268"/>
+            <w:tcW w:type="dxa" w:w="2254"/>
             <w:vAlign w:val="center"/>
             <w:tcMar>
               <w:top w:w="80" w:type="dxa"/>
@@ -996,7 +996,7 @@
       <w:tr>
         <w:tc>
           <w:tcPr>
-            <w:tcW w:type="dxa" w:w="1814"/>
+            <w:tcW w:type="dxa" w:w="1803"/>
             <w:shd w:fill="F3F6FA"/>
             <w:vAlign w:val="center"/>
             <w:tcMar>
@@ -1024,7 +1024,7 @@
         </w:tc>
         <w:tc>
           <w:tcPr>
-            <w:tcW w:type="dxa" w:w="5329"/>
+            <w:tcW w:type="dxa" w:w="5297"/>
             <w:shd w:fill="F3F6FA"/>
             <w:vAlign w:val="center"/>
             <w:tcMar>
@@ -1052,7 +1052,7 @@
         </w:tc>
         <w:tc>
           <w:tcPr>
-            <w:tcW w:type="dxa" w:w="2268"/>
+            <w:tcW w:type="dxa" w:w="2254"/>
             <w:shd w:fill="F3F6FA"/>
             <w:vAlign w:val="center"/>
             <w:tcMar>
@@ -1082,7 +1082,7 @@
       <w:tr>
         <w:tc>
           <w:tcPr>
-            <w:tcW w:type="dxa" w:w="1814"/>
+            <w:tcW w:type="dxa" w:w="1803"/>
             <w:vAlign w:val="center"/>
             <w:tcMar>
               <w:top w:w="80" w:type="dxa"/>
@@ -1109,7 +1109,7 @@
         </w:tc>
         <w:tc>
           <w:tcPr>
-            <w:tcW w:type="dxa" w:w="5329"/>
+            <w:tcW w:type="dxa" w:w="5297"/>
             <w:vAlign w:val="center"/>
             <w:tcMar>
               <w:top w:w="80" w:type="dxa"/>
@@ -1136,7 +1136,7 @@
         </w:tc>
         <w:tc>
           <w:tcPr>
-            <w:tcW w:type="dxa" w:w="2268"/>
+            <w:tcW w:type="dxa" w:w="2254"/>
             <w:vAlign w:val="center"/>
             <w:tcMar>
               <w:top w:w="80" w:type="dxa"/>
@@ -1179,8 +1179,8 @@
         <w:tblLook w:firstColumn="1" w:firstRow="1" w:lastColumn="0" w:lastRow="0" w:noHBand="0" w:noVBand="1" w:val="04A0"/>
       </w:tblPr>
       <w:tblGrid>
-        <w:gridCol w:w="2268"/>
-        <w:gridCol w:w="7143"/>
+        <w:gridCol w:w="2254"/>
+        <w:gridCol w:w="7100"/>
       </w:tblGrid>
       <w:tr>
         <w:trPr>
@@ -1188,7 +1188,7 @@
         </w:trPr>
         <w:tc>
           <w:tcPr>
-            <w:tcW w:type="dxa" w:w="5018"/>
+            <w:tcW w:type="dxa" w:w="2254"/>
             <w:shd w:fill="132238"/>
             <w:vAlign w:val="center"/>
             <w:tcMar>
@@ -1216,7 +1216,7 @@
         </w:tc>
         <w:tc>
           <w:tcPr>
-            <w:tcW w:type="dxa" w:w="5018"/>
+            <w:tcW w:type="dxa" w:w="7100"/>
             <w:shd w:fill="132238"/>
             <w:vAlign w:val="center"/>
             <w:tcMar>
@@ -1246,7 +1246,7 @@
       <w:tr>
         <w:tc>
           <w:tcPr>
-            <w:tcW w:type="dxa" w:w="2268"/>
+            <w:tcW w:type="dxa" w:w="2254"/>
             <w:shd w:fill="F3F6FA"/>
             <w:vAlign w:val="center"/>
             <w:tcMar>
@@ -1274,7 +1274,7 @@
         </w:tc>
         <w:tc>
           <w:tcPr>
-            <w:tcW w:type="dxa" w:w="7143"/>
+            <w:tcW w:type="dxa" w:w="7100"/>
             <w:shd w:fill="F3F6FA"/>
             <w:vAlign w:val="center"/>
             <w:tcMar>
@@ -1304,7 +1304,7 @@
       <w:tr>
         <w:tc>
           <w:tcPr>
-            <w:tcW w:type="dxa" w:w="2268"/>
+            <w:tcW w:type="dxa" w:w="2254"/>
             <w:vAlign w:val="center"/>
             <w:tcMar>
               <w:top w:w="80" w:type="dxa"/>
@@ -1331,7 +1331,7 @@
         </w:tc>
         <w:tc>
           <w:tcPr>
-            <w:tcW w:type="dxa" w:w="7143"/>
+            <w:tcW w:type="dxa" w:w="7100"/>
             <w:vAlign w:val="center"/>
             <w:tcMar>
               <w:top w:w="80" w:type="dxa"/>
@@ -1360,7 +1360,7 @@
       <w:tr>
         <w:tc>
           <w:tcPr>
-            <w:tcW w:type="dxa" w:w="2268"/>
+            <w:tcW w:type="dxa" w:w="2254"/>
             <w:shd w:fill="F3F6FA"/>
             <w:vAlign w:val="center"/>
             <w:tcMar>
@@ -1388,7 +1388,7 @@
         </w:tc>
         <w:tc>
           <w:tcPr>
-            <w:tcW w:type="dxa" w:w="7143"/>
+            <w:tcW w:type="dxa" w:w="7100"/>
             <w:shd w:fill="F3F6FA"/>
             <w:vAlign w:val="center"/>
             <w:tcMar>
@@ -1437,9 +1437,9 @@
         <w:tblLook w:firstColumn="1" w:firstRow="1" w:lastColumn="0" w:lastRow="0" w:noHBand="0" w:noVBand="1" w:val="04A0"/>
       </w:tblPr>
       <w:tblGrid>
-        <w:gridCol w:w="2268"/>
-        <w:gridCol w:w="1701"/>
-        <w:gridCol w:w="5443"/>
+        <w:gridCol w:w="2254"/>
+        <w:gridCol w:w="1691"/>
+        <w:gridCol w:w="5410"/>
       </w:tblGrid>
       <w:tr>
         <w:trPr>
@@ -1447,7 +1447,7 @@
         </w:trPr>
         <w:tc>
           <w:tcPr>
-            <w:tcW w:type="dxa" w:w="3345"/>
+            <w:tcW w:type="dxa" w:w="2254"/>
             <w:shd w:fill="132238"/>
             <w:vAlign w:val="center"/>
             <w:tcMar>
@@ -1475,7 +1475,7 @@
         </w:tc>
         <w:tc>
           <w:tcPr>
-            <w:tcW w:type="dxa" w:w="3345"/>
+            <w:tcW w:type="dxa" w:w="1691"/>
             <w:shd w:fill="132238"/>
             <w:vAlign w:val="center"/>
             <w:tcMar>
@@ -1503,7 +1503,7 @@
         </w:tc>
         <w:tc>
           <w:tcPr>
-            <w:tcW w:type="dxa" w:w="3345"/>
+            <w:tcW w:type="dxa" w:w="5410"/>
             <w:shd w:fill="132238"/>
             <w:vAlign w:val="center"/>
             <w:tcMar>
@@ -1533,7 +1533,7 @@
       <w:tr>
         <w:tc>
           <w:tcPr>
-            <w:tcW w:type="dxa" w:w="2268"/>
+            <w:tcW w:type="dxa" w:w="2254"/>
             <w:shd w:fill="F3F6FA"/>
             <w:vAlign w:val="center"/>
             <w:tcMar>
@@ -1561,7 +1561,7 @@
         </w:tc>
         <w:tc>
           <w:tcPr>
-            <w:tcW w:type="dxa" w:w="1701"/>
+            <w:tcW w:type="dxa" w:w="1691"/>
             <w:shd w:fill="F3F6FA"/>
             <w:vAlign w:val="center"/>
             <w:tcMar>
@@ -1589,7 +1589,7 @@
         </w:tc>
         <w:tc>
           <w:tcPr>
-            <w:tcW w:type="dxa" w:w="5443"/>
+            <w:tcW w:type="dxa" w:w="5410"/>
             <w:shd w:fill="F3F6FA"/>
             <w:vAlign w:val="center"/>
             <w:tcMar>
@@ -1611,7 +1611,7 @@
                 <w:color w:val="172033"/>
                 <w:sz w:val="14"/>
               </w:rPr>
-              <w:t>32 aktivitas: 27 draf, 5 terposting, 0 closing.</w:t>
+              <w:t>52 aktivitas: 39 draf, 13 terposting, 0 closing.</w:t>
             </w:r>
           </w:p>
         </w:tc>
@@ -1619,7 +1619,7 @@
       <w:tr>
         <w:tc>
           <w:tcPr>
-            <w:tcW w:type="dxa" w:w="2268"/>
+            <w:tcW w:type="dxa" w:w="2254"/>
             <w:vAlign w:val="center"/>
             <w:tcMar>
               <w:top w:w="80" w:type="dxa"/>
@@ -1646,7 +1646,7 @@
         </w:tc>
         <w:tc>
           <w:tcPr>
-            <w:tcW w:type="dxa" w:w="1701"/>
+            <w:tcW w:type="dxa" w:w="1691"/>
             <w:vAlign w:val="center"/>
             <w:tcMar>
               <w:top w:w="80" w:type="dxa"/>
@@ -1667,13 +1667,13 @@
                 <w:color w:val="172033"/>
                 <w:sz w:val="14"/>
               </w:rPr>
-              <w:t>Lulus</w:t>
+              <w:t>Catatan</w:t>
             </w:r>
           </w:p>
         </w:tc>
         <w:tc>
           <w:tcPr>
-            <w:tcW w:type="dxa" w:w="5443"/>
+            <w:tcW w:type="dxa" w:w="5410"/>
             <w:vAlign w:val="center"/>
             <w:tcMar>
               <w:top w:w="80" w:type="dxa"/>
@@ -1694,7 +1694,7 @@
                 <w:color w:val="172033"/>
                 <w:sz w:val="14"/>
               </w:rPr>
-              <w:t>Dua jurnal contoh seimbang tersimpan dan terposting.</w:t>
+              <w:t>8 jurnal manual terposting; daftar sempat lulus, tetapi endpoint daftar regresi setelah restart.</w:t>
             </w:r>
           </w:p>
         </w:tc>
@@ -1702,7 +1702,7 @@
       <w:tr>
         <w:tc>
           <w:tcPr>
-            <w:tcW w:type="dxa" w:w="2268"/>
+            <w:tcW w:type="dxa" w:w="2254"/>
             <w:shd w:fill="F3F6FA"/>
             <w:vAlign w:val="center"/>
             <w:tcMar>
@@ -1730,7 +1730,7 @@
         </w:tc>
         <w:tc>
           <w:tcPr>
-            <w:tcW w:type="dxa" w:w="1701"/>
+            <w:tcW w:type="dxa" w:w="1691"/>
             <w:shd w:fill="F3F6FA"/>
             <w:vAlign w:val="center"/>
             <w:tcMar>
@@ -1758,7 +1758,7 @@
         </w:tc>
         <w:tc>
           <w:tcPr>
-            <w:tcW w:type="dxa" w:w="5443"/>
+            <w:tcW w:type="dxa" w:w="5410"/>
             <w:shd w:fill="F3F6FA"/>
             <w:vAlign w:val="center"/>
             <w:tcMar>
@@ -1780,7 +1780,7 @@
                 <w:color w:val="172033"/>
                 <w:sz w:val="14"/>
               </w:rPr>
-              <w:t>1 transaksi Rp1.200.000; tertahan karena akun HPP/persediaan belum dipetakan.</w:t>
+              <w:t>1 transaksi Rp1.200.000; akun HPP ada, tetapi akun persediaan Master Aset masih kosong.</w:t>
             </w:r>
           </w:p>
         </w:tc>
@@ -1788,7 +1788,7 @@
       <w:tr>
         <w:tc>
           <w:tcPr>
-            <w:tcW w:type="dxa" w:w="2268"/>
+            <w:tcW w:type="dxa" w:w="2254"/>
             <w:vAlign w:val="center"/>
             <w:tcMar>
               <w:top w:w="80" w:type="dxa"/>
@@ -1815,7 +1815,7 @@
         </w:tc>
         <w:tc>
           <w:tcPr>
-            <w:tcW w:type="dxa" w:w="1701"/>
+            <w:tcW w:type="dxa" w:w="1691"/>
             <w:vAlign w:val="center"/>
             <w:tcMar>
               <w:top w:w="80" w:type="dxa"/>
@@ -1842,7 +1842,7 @@
         </w:tc>
         <w:tc>
           <w:tcPr>
-            <w:tcW w:type="dxa" w:w="5443"/>
+            <w:tcW w:type="dxa" w:w="5410"/>
             <w:vAlign w:val="center"/>
             <w:tcMar>
               <w:top w:w="80" w:type="dxa"/>
@@ -1863,7 +1863,7 @@
                 <w:color w:val="172033"/>
                 <w:sz w:val="14"/>
               </w:rPr>
-              <w:t>Transaksi sample tampil; prasyarat pemetaan akun masih menahan posting.</w:t>
+              <w:t>Perpindahan submenu dapat mempertahankan pratinjau HPP; indikasi state layar tidak direset.</w:t>
             </w:r>
           </w:p>
         </w:tc>
@@ -1871,7 +1871,7 @@
       <w:tr>
         <w:tc>
           <w:tcPr>
-            <w:tcW w:type="dxa" w:w="2268"/>
+            <w:tcW w:type="dxa" w:w="2254"/>
             <w:shd w:fill="F3F6FA"/>
             <w:vAlign w:val="center"/>
             <w:tcMar>
@@ -1899,7 +1899,176 @@
         </w:tc>
         <w:tc>
           <w:tcPr>
-            <w:tcW w:type="dxa" w:w="1701"/>
+            <w:tcW w:type="dxa" w:w="1691"/>
+            <w:shd w:fill="F3F6FA"/>
+            <w:vAlign w:val="center"/>
+            <w:tcMar>
+              <w:top w:w="80" w:type="dxa"/>
+              <w:start w:w="100" w:type="dxa"/>
+              <w:bottom w:w="80" w:type="dxa"/>
+              <w:end w:w="100" w:type="dxa"/>
+            </w:tcMar>
+          </w:tcPr>
+          <w:p>
+            <w:pPr>
+              <w:spacing w:after="0"/>
+            </w:pPr>
+            <w:r/>
+            <w:r>
+              <w:rPr>
+                <w:rFonts w:ascii="Aptos" w:hAnsi="Aptos"/>
+                <w:b w:val="0"/>
+                <w:color w:val="172033"/>
+                <w:sz w:val="14"/>
+              </w:rPr>
+              <w:t>Catatan</w:t>
+            </w:r>
+          </w:p>
+        </w:tc>
+        <w:tc>
+          <w:tcPr>
+            <w:tcW w:type="dxa" w:w="5410"/>
+            <w:shd w:fill="F3F6FA"/>
+            <w:vAlign w:val="center"/>
+            <w:tcMar>
+              <w:top w:w="80" w:type="dxa"/>
+              <w:start w:w="100" w:type="dxa"/>
+              <w:bottom w:w="80" w:type="dxa"/>
+              <w:end w:w="100" w:type="dxa"/>
+            </w:tcMar>
+          </w:tcPr>
+          <w:p>
+            <w:pPr>
+              <w:spacing w:after="0"/>
+            </w:pPr>
+            <w:r/>
+            <w:r>
+              <w:rPr>
+                <w:rFonts w:ascii="Aptos" w:hAnsi="Aptos"/>
+                <w:b w:val="0"/>
+                <w:color w:val="172033"/>
+                <w:sz w:val="14"/>
+              </w:rPr>
+              <w:t>2 faktur Rp600.000 dan Rp450.000 tampil; tertahan oleh akun persediaan Master Aset.</w:t>
+            </w:r>
+          </w:p>
+        </w:tc>
+      </w:tr>
+      <w:tr>
+        <w:tc>
+          <w:tcPr>
+            <w:tcW w:type="dxa" w:w="2254"/>
+            <w:vAlign w:val="center"/>
+            <w:tcMar>
+              <w:top w:w="80" w:type="dxa"/>
+              <w:start w:w="100" w:type="dxa"/>
+              <w:bottom w:w="80" w:type="dxa"/>
+              <w:end w:w="100" w:type="dxa"/>
+            </w:tcMar>
+          </w:tcPr>
+          <w:p>
+            <w:pPr>
+              <w:spacing w:after="0"/>
+            </w:pPr>
+            <w:r/>
+            <w:r>
+              <w:rPr>
+                <w:rFonts w:ascii="Aptos" w:hAnsi="Aptos"/>
+                <w:b w:val="0"/>
+                <w:color w:val="172033"/>
+                <w:sz w:val="14"/>
+              </w:rPr>
+              <w:t>Posting Bayar Hutang</w:t>
+            </w:r>
+          </w:p>
+        </w:tc>
+        <w:tc>
+          <w:tcPr>
+            <w:tcW w:type="dxa" w:w="1691"/>
+            <w:vAlign w:val="center"/>
+            <w:tcMar>
+              <w:top w:w="80" w:type="dxa"/>
+              <w:start w:w="100" w:type="dxa"/>
+              <w:bottom w:w="80" w:type="dxa"/>
+              <w:end w:w="100" w:type="dxa"/>
+            </w:tcMar>
+          </w:tcPr>
+          <w:p>
+            <w:pPr>
+              <w:spacing w:after="0"/>
+            </w:pPr>
+            <w:r/>
+            <w:r>
+              <w:rPr>
+                <w:rFonts w:ascii="Aptos" w:hAnsi="Aptos"/>
+                <w:b w:val="0"/>
+                <w:color w:val="172033"/>
+                <w:sz w:val="14"/>
+              </w:rPr>
+              <w:t>Lulus</w:t>
+            </w:r>
+          </w:p>
+        </w:tc>
+        <w:tc>
+          <w:tcPr>
+            <w:tcW w:type="dxa" w:w="5410"/>
+            <w:vAlign w:val="center"/>
+            <w:tcMar>
+              <w:top w:w="80" w:type="dxa"/>
+              <w:start w:w="100" w:type="dxa"/>
+              <w:bottom w:w="80" w:type="dxa"/>
+              <w:end w:w="100" w:type="dxa"/>
+            </w:tcMar>
+          </w:tcPr>
+          <w:p>
+            <w:pPr>
+              <w:spacing w:after="0"/>
+            </w:pPr>
+            <w:r/>
+            <w:r>
+              <w:rPr>
+                <w:rFonts w:ascii="Aptos" w:hAnsi="Aptos"/>
+                <w:b w:val="0"/>
+                <w:color w:val="172033"/>
+                <w:sz w:val="14"/>
+              </w:rPr>
+              <w:t>1 pembayaran Rp150.000 siap; 1 pembayaran Rp200.000 telah diposting saat penyiapan.</w:t>
+            </w:r>
+          </w:p>
+        </w:tc>
+      </w:tr>
+      <w:tr>
+        <w:tc>
+          <w:tcPr>
+            <w:tcW w:type="dxa" w:w="2254"/>
+            <w:shd w:fill="F3F6FA"/>
+            <w:vAlign w:val="center"/>
+            <w:tcMar>
+              <w:top w:w="80" w:type="dxa"/>
+              <w:start w:w="100" w:type="dxa"/>
+              <w:bottom w:w="80" w:type="dxa"/>
+              <w:end w:w="100" w:type="dxa"/>
+            </w:tcMar>
+          </w:tcPr>
+          <w:p>
+            <w:pPr>
+              <w:spacing w:after="0"/>
+            </w:pPr>
+            <w:r/>
+            <w:r>
+              <w:rPr>
+                <w:rFonts w:ascii="Aptos" w:hAnsi="Aptos"/>
+                <w:b w:val="0"/>
+                <w:color w:val="172033"/>
+                <w:sz w:val="14"/>
+              </w:rPr>
+              <w:t>Posting Terima Piutang</w:t>
+            </w:r>
+          </w:p>
+        </w:tc>
+        <w:tc>
+          <w:tcPr>
+            <w:tcW w:type="dxa" w:w="1691"/>
             <w:shd w:fill="F3F6FA"/>
             <w:vAlign w:val="center"/>
             <w:tcMar>
@@ -1927,7 +2096,7 @@
         </w:tc>
         <w:tc>
           <w:tcPr>
-            <w:tcW w:type="dxa" w:w="5443"/>
+            <w:tcW w:type="dxa" w:w="5410"/>
             <w:shd w:fill="F3F6FA"/>
             <w:vAlign w:val="center"/>
             <w:tcMar>
@@ -1949,7 +2118,7 @@
                 <w:color w:val="172033"/>
                 <w:sz w:val="14"/>
               </w:rPr>
-              <w:t>Layar stabil; 0 dokumen belum diposting pada periode uji.</w:t>
+              <w:t>1 penerimaan Rp200.000 siap; 1 penerimaan Rp175.000 telah diposting saat penyiapan.</w:t>
             </w:r>
           </w:p>
         </w:tc>
@@ -1957,7 +2126,7 @@
       <w:tr>
         <w:tc>
           <w:tcPr>
-            <w:tcW w:type="dxa" w:w="2268"/>
+            <w:tcW w:type="dxa" w:w="2254"/>
             <w:vAlign w:val="center"/>
             <w:tcMar>
               <w:top w:w="80" w:type="dxa"/>
@@ -1978,13 +2147,13 @@
                 <w:color w:val="172033"/>
                 <w:sz w:val="14"/>
               </w:rPr>
-              <w:t>Posting Bayar Hutang</w:t>
+              <w:t>Saldo Awal</w:t>
             </w:r>
           </w:p>
         </w:tc>
         <w:tc>
           <w:tcPr>
-            <w:tcW w:type="dxa" w:w="1701"/>
+            <w:tcW w:type="dxa" w:w="1691"/>
             <w:vAlign w:val="center"/>
             <w:tcMar>
               <w:top w:w="80" w:type="dxa"/>
@@ -2011,7 +2180,7 @@
         </w:tc>
         <w:tc>
           <w:tcPr>
-            <w:tcW w:type="dxa" w:w="5443"/>
+            <w:tcW w:type="dxa" w:w="5410"/>
             <w:vAlign w:val="center"/>
             <w:tcMar>
               <w:top w:w="80" w:type="dxa"/>
@@ -2032,7 +2201,7 @@
                 <w:color w:val="172033"/>
                 <w:sz w:val="14"/>
               </w:rPr>
-              <w:t>Layar stabil; 0 dokumen belum diposting pada periode uji.</w:t>
+              <w:t>5 akun terposting; total Debet dan Kredit masing-masing Rp22.000.000.</w:t>
             </w:r>
           </w:p>
         </w:tc>
@@ -2040,7 +2209,7 @@
       <w:tr>
         <w:tc>
           <w:tcPr>
-            <w:tcW w:type="dxa" w:w="2268"/>
+            <w:tcW w:type="dxa" w:w="2254"/>
             <w:shd w:fill="F3F6FA"/>
             <w:vAlign w:val="center"/>
             <w:tcMar>
@@ -2062,13 +2231,13 @@
                 <w:color w:val="172033"/>
                 <w:sz w:val="14"/>
               </w:rPr>
-              <w:t>Posting Terima Piutang</w:t>
+              <w:t>Jurnal Penyesuaian</w:t>
             </w:r>
           </w:p>
         </w:tc>
         <w:tc>
           <w:tcPr>
-            <w:tcW w:type="dxa" w:w="1701"/>
+            <w:tcW w:type="dxa" w:w="1691"/>
             <w:shd w:fill="F3F6FA"/>
             <w:vAlign w:val="center"/>
             <w:tcMar>
@@ -2096,7 +2265,7 @@
         </w:tc>
         <w:tc>
           <w:tcPr>
-            <w:tcW w:type="dxa" w:w="5443"/>
+            <w:tcW w:type="dxa" w:w="5410"/>
             <w:shd w:fill="F3F6FA"/>
             <w:vAlign w:val="center"/>
             <w:tcMar>
@@ -2118,7 +2287,7 @@
                 <w:color w:val="172033"/>
                 <w:sz w:val="14"/>
               </w:rPr>
-              <w:t>Layar stabil; 0 dokumen belum diposting pada periode uji.</w:t>
+              <w:t>3 template sampel: listrik, sewa outlet, dan cadangan kerugian piutang.</w:t>
             </w:r>
           </w:p>
         </w:tc>
@@ -2126,176 +2295,7 @@
       <w:tr>
         <w:tc>
           <w:tcPr>
-            <w:tcW w:type="dxa" w:w="2268"/>
-            <w:vAlign w:val="center"/>
-            <w:tcMar>
-              <w:top w:w="80" w:type="dxa"/>
-              <w:start w:w="100" w:type="dxa"/>
-              <w:bottom w:w="80" w:type="dxa"/>
-              <w:end w:w="100" w:type="dxa"/>
-            </w:tcMar>
-          </w:tcPr>
-          <w:p>
-            <w:pPr>
-              <w:spacing w:after="0"/>
-            </w:pPr>
-            <w:r/>
-            <w:r>
-              <w:rPr>
-                <w:rFonts w:ascii="Aptos" w:hAnsi="Aptos"/>
-                <w:b w:val="0"/>
-                <w:color w:val="172033"/>
-                <w:sz w:val="14"/>
-              </w:rPr>
-              <w:t>Saldo Awal</w:t>
-            </w:r>
-          </w:p>
-        </w:tc>
-        <w:tc>
-          <w:tcPr>
-            <w:tcW w:type="dxa" w:w="1701"/>
-            <w:vAlign w:val="center"/>
-            <w:tcMar>
-              <w:top w:w="80" w:type="dxa"/>
-              <w:start w:w="100" w:type="dxa"/>
-              <w:bottom w:w="80" w:type="dxa"/>
-              <w:end w:w="100" w:type="dxa"/>
-            </w:tcMar>
-          </w:tcPr>
-          <w:p>
-            <w:pPr>
-              <w:spacing w:after="0"/>
-            </w:pPr>
-            <w:r/>
-            <w:r>
-              <w:rPr>
-                <w:rFonts w:ascii="Aptos" w:hAnsi="Aptos"/>
-                <w:b w:val="0"/>
-                <w:color w:val="172033"/>
-                <w:sz w:val="14"/>
-              </w:rPr>
-              <w:t>Lulus</w:t>
-            </w:r>
-          </w:p>
-        </w:tc>
-        <w:tc>
-          <w:tcPr>
-            <w:tcW w:type="dxa" w:w="5443"/>
-            <w:vAlign w:val="center"/>
-            <w:tcMar>
-              <w:top w:w="80" w:type="dxa"/>
-              <w:start w:w="100" w:type="dxa"/>
-              <w:bottom w:w="80" w:type="dxa"/>
-              <w:end w:w="100" w:type="dxa"/>
-            </w:tcMar>
-          </w:tcPr>
-          <w:p>
-            <w:pPr>
-              <w:spacing w:after="0"/>
-            </w:pPr>
-            <w:r/>
-            <w:r>
-              <w:rPr>
-                <w:rFonts w:ascii="Aptos" w:hAnsi="Aptos"/>
-                <w:b w:val="0"/>
-                <w:color w:val="172033"/>
-                <w:sz w:val="14"/>
-              </w:rPr>
-              <w:t>Fungsi tambah/Excel/posting pembukaan tersedia; data sample kosong.</w:t>
-            </w:r>
-          </w:p>
-        </w:tc>
-      </w:tr>
-      <w:tr>
-        <w:tc>
-          <w:tcPr>
-            <w:tcW w:type="dxa" w:w="2268"/>
-            <w:shd w:fill="F3F6FA"/>
-            <w:vAlign w:val="center"/>
-            <w:tcMar>
-              <w:top w:w="80" w:type="dxa"/>
-              <w:start w:w="100" w:type="dxa"/>
-              <w:bottom w:w="80" w:type="dxa"/>
-              <w:end w:w="100" w:type="dxa"/>
-            </w:tcMar>
-          </w:tcPr>
-          <w:p>
-            <w:pPr>
-              <w:spacing w:after="0"/>
-            </w:pPr>
-            <w:r/>
-            <w:r>
-              <w:rPr>
-                <w:rFonts w:ascii="Aptos" w:hAnsi="Aptos"/>
-                <w:b w:val="0"/>
-                <w:color w:val="172033"/>
-                <w:sz w:val="14"/>
-              </w:rPr>
-              <w:t>Jurnal Penyesuaian</w:t>
-            </w:r>
-          </w:p>
-        </w:tc>
-        <w:tc>
-          <w:tcPr>
-            <w:tcW w:type="dxa" w:w="1701"/>
-            <w:shd w:fill="F3F6FA"/>
-            <w:vAlign w:val="center"/>
-            <w:tcMar>
-              <w:top w:w="80" w:type="dxa"/>
-              <w:start w:w="100" w:type="dxa"/>
-              <w:bottom w:w="80" w:type="dxa"/>
-              <w:end w:w="100" w:type="dxa"/>
-            </w:tcMar>
-          </w:tcPr>
-          <w:p>
-            <w:pPr>
-              <w:spacing w:after="0"/>
-            </w:pPr>
-            <w:r/>
-            <w:r>
-              <w:rPr>
-                <w:rFonts w:ascii="Aptos" w:hAnsi="Aptos"/>
-                <w:b w:val="0"/>
-                <w:color w:val="172033"/>
-                <w:sz w:val="14"/>
-              </w:rPr>
-              <w:t>Lulus</w:t>
-            </w:r>
-          </w:p>
-        </w:tc>
-        <w:tc>
-          <w:tcPr>
-            <w:tcW w:type="dxa" w:w="5443"/>
-            <w:shd w:fill="F3F6FA"/>
-            <w:vAlign w:val="center"/>
-            <w:tcMar>
-              <w:top w:w="80" w:type="dxa"/>
-              <w:start w:w="100" w:type="dxa"/>
-              <w:bottom w:w="80" w:type="dxa"/>
-              <w:end w:w="100" w:type="dxa"/>
-            </w:tcMar>
-          </w:tcPr>
-          <w:p>
-            <w:pPr>
-              <w:spacing w:after="0"/>
-            </w:pPr>
-            <w:r/>
-            <w:r>
-              <w:rPr>
-                <w:rFonts w:ascii="Aptos" w:hAnsi="Aptos"/>
-                <w:b w:val="0"/>
-                <w:color w:val="172033"/>
-                <w:sz w:val="14"/>
-              </w:rPr>
-              <w:t>Fungsi template dan posting tersedia; template sample kosong.</w:t>
-            </w:r>
-          </w:p>
-        </w:tc>
-      </w:tr>
-      <w:tr>
-        <w:tc>
-          <w:tcPr>
-            <w:tcW w:type="dxa" w:w="2268"/>
+            <w:tcW w:type="dxa" w:w="2254"/>
             <w:vAlign w:val="center"/>
             <w:tcMar>
               <w:top w:w="80" w:type="dxa"/>
@@ -2322,7 +2322,7 @@
         </w:tc>
         <w:tc>
           <w:tcPr>
-            <w:tcW w:type="dxa" w:w="1701"/>
+            <w:tcW w:type="dxa" w:w="1691"/>
             <w:vAlign w:val="center"/>
             <w:tcMar>
               <w:top w:w="80" w:type="dxa"/>
@@ -2349,7 +2349,7 @@
         </w:tc>
         <w:tc>
           <w:tcPr>
-            <w:tcW w:type="dxa" w:w="5443"/>
+            <w:tcW w:type="dxa" w:w="5410"/>
             <w:vAlign w:val="center"/>
             <w:tcMar>
               <w:top w:w="80" w:type="dxa"/>
@@ -2370,7 +2370,7 @@
                 <w:color w:val="172033"/>
                 <w:sz w:val="14"/>
               </w:rPr>
-              <w:t>Pratinjau tersedia; aksi final sengaja tidak mengunci periode bersama.</w:t>
+              <w:t>Draf tampil; layar tetap menyatakan Laba Ditahan belum diatur meski toko sudah dipetakan.</w:t>
             </w:r>
           </w:p>
         </w:tc>
@@ -2378,7 +2378,7 @@
       <w:tr>
         <w:tc>
           <w:tcPr>
-            <w:tcW w:type="dxa" w:w="2268"/>
+            <w:tcW w:type="dxa" w:w="2254"/>
             <w:shd w:fill="F3F6FA"/>
             <w:vAlign w:val="center"/>
             <w:tcMar>
@@ -2406,7 +2406,7 @@
         </w:tc>
         <w:tc>
           <w:tcPr>
-            <w:tcW w:type="dxa" w:w="1701"/>
+            <w:tcW w:type="dxa" w:w="1691"/>
             <w:shd w:fill="F3F6FA"/>
             <w:vAlign w:val="center"/>
             <w:tcMar>
@@ -2434,7 +2434,7 @@
         </w:tc>
         <w:tc>
           <w:tcPr>
-            <w:tcW w:type="dxa" w:w="5443"/>
+            <w:tcW w:type="dxa" w:w="5410"/>
             <w:shd w:fill="F3F6FA"/>
             <w:vAlign w:val="center"/>
             <w:tcMar>
@@ -2456,7 +2456,7 @@
                 <w:color w:val="172033"/>
                 <w:sz w:val="14"/>
               </w:rPr>
-              <w:t>Daftar stabil dan masih kosong; aksi final tidak dijalankan.</w:t>
+              <w:t>Form Closing Baru tampil; penyimpanan final sengaja tidak dijalankan.</w:t>
             </w:r>
           </w:p>
         </w:tc>
@@ -2464,7 +2464,7 @@
       <w:tr>
         <w:tc>
           <w:tcPr>
-            <w:tcW w:type="dxa" w:w="2268"/>
+            <w:tcW w:type="dxa" w:w="2254"/>
             <w:vAlign w:val="center"/>
             <w:tcMar>
               <w:top w:w="80" w:type="dxa"/>
@@ -2491,7 +2491,7 @@
         </w:tc>
         <w:tc>
           <w:tcPr>
-            <w:tcW w:type="dxa" w:w="1701"/>
+            <w:tcW w:type="dxa" w:w="1691"/>
             <w:vAlign w:val="center"/>
             <w:tcMar>
               <w:top w:w="80" w:type="dxa"/>
@@ -2518,7 +2518,7 @@
         </w:tc>
         <w:tc>
           <w:tcPr>
-            <w:tcW w:type="dxa" w:w="5443"/>
+            <w:tcW w:type="dxa" w:w="5410"/>
             <w:vAlign w:val="center"/>
             <w:tcMar>
               <w:top w:w="80" w:type="dxa"/>
@@ -2547,7 +2547,7 @@
       <w:tr>
         <w:tc>
           <w:tcPr>
-            <w:tcW w:type="dxa" w:w="2268"/>
+            <w:tcW w:type="dxa" w:w="2254"/>
             <w:shd w:fill="F3F6FA"/>
             <w:vAlign w:val="center"/>
             <w:tcMar>
@@ -2575,7 +2575,7 @@
         </w:tc>
         <w:tc>
           <w:tcPr>
-            <w:tcW w:type="dxa" w:w="1701"/>
+            <w:tcW w:type="dxa" w:w="1691"/>
             <w:shd w:fill="F3F6FA"/>
             <w:vAlign w:val="center"/>
             <w:tcMar>
@@ -2603,7 +2603,7 @@
         </w:tc>
         <w:tc>
           <w:tcPr>
-            <w:tcW w:type="dxa" w:w="5443"/>
+            <w:tcW w:type="dxa" w:w="5410"/>
             <w:shd w:fill="F3F6FA"/>
             <w:vAlign w:val="center"/>
             <w:tcMar>
@@ -2625,7 +2625,7 @@
                 <w:color w:val="172033"/>
                 <w:sz w:val="14"/>
               </w:rPr>
-              <w:t>Unit/tahun tampil; pagu 0 dan ada overflow horizontal pada lebar 1264 px.</w:t>
+              <w:t>3 item, total rencana Rp45.000.000; ada overflow horizontal pada lebar 1264 px.</w:t>
             </w:r>
           </w:p>
         </w:tc>
@@ -2633,7 +2633,7 @@
       <w:tr>
         <w:tc>
           <w:tcPr>
-            <w:tcW w:type="dxa" w:w="2268"/>
+            <w:tcW w:type="dxa" w:w="2254"/>
             <w:vAlign w:val="center"/>
             <w:tcMar>
               <w:top w:w="80" w:type="dxa"/>
@@ -2660,7 +2660,7 @@
         </w:tc>
         <w:tc>
           <w:tcPr>
-            <w:tcW w:type="dxa" w:w="1701"/>
+            <w:tcW w:type="dxa" w:w="1691"/>
             <w:vAlign w:val="center"/>
             <w:tcMar>
               <w:top w:w="80" w:type="dxa"/>
@@ -2687,7 +2687,7 @@
         </w:tc>
         <w:tc>
           <w:tcPr>
-            <w:tcW w:type="dxa" w:w="5443"/>
+            <w:tcW w:type="dxa" w:w="5410"/>
             <w:vAlign w:val="center"/>
             <w:tcMar>
               <w:top w:w="80" w:type="dxa"/>
@@ -2708,7 +2708,7 @@
                 <w:color w:val="172033"/>
                 <w:sz w:val="14"/>
               </w:rPr>
-              <w:t>311 akun, 21 halaman.</w:t>
+              <w:t>317 akun tampil; 256 akun yang belum terpetakan telah ditautkan secara aman.</w:t>
             </w:r>
           </w:p>
         </w:tc>
@@ -2716,7 +2716,7 @@
       <w:tr>
         <w:tc>
           <w:tcPr>
-            <w:tcW w:type="dxa" w:w="2268"/>
+            <w:tcW w:type="dxa" w:w="2254"/>
             <w:shd w:fill="F3F6FA"/>
             <w:vAlign w:val="center"/>
             <w:tcMar>
@@ -2744,7 +2744,7 @@
         </w:tc>
         <w:tc>
           <w:tcPr>
-            <w:tcW w:type="dxa" w:w="1701"/>
+            <w:tcW w:type="dxa" w:w="1691"/>
             <w:shd w:fill="F3F6FA"/>
             <w:vAlign w:val="center"/>
             <w:tcMar>
@@ -2772,7 +2772,7 @@
         </w:tc>
         <w:tc>
           <w:tcPr>
-            <w:tcW w:type="dxa" w:w="5443"/>
+            <w:tcW w:type="dxa" w:w="5410"/>
             <w:shd w:fill="F3F6FA"/>
             <w:vAlign w:val="center"/>
             <w:tcMar>
@@ -2802,7 +2802,7 @@
       <w:tr>
         <w:tc>
           <w:tcPr>
-            <w:tcW w:type="dxa" w:w="2268"/>
+            <w:tcW w:type="dxa" w:w="2254"/>
             <w:vAlign w:val="center"/>
             <w:tcMar>
               <w:top w:w="80" w:type="dxa"/>
@@ -2829,7 +2829,7 @@
         </w:tc>
         <w:tc>
           <w:tcPr>
-            <w:tcW w:type="dxa" w:w="1701"/>
+            <w:tcW w:type="dxa" w:w="1691"/>
             <w:vAlign w:val="center"/>
             <w:tcMar>
               <w:top w:w="80" w:type="dxa"/>
@@ -2856,7 +2856,7 @@
         </w:tc>
         <w:tc>
           <w:tcPr>
-            <w:tcW w:type="dxa" w:w="5443"/>
+            <w:tcW w:type="dxa" w:w="5410"/>
             <w:vAlign w:val="center"/>
             <w:tcMar>
               <w:top w:w="80" w:type="dxa"/>
@@ -2885,7 +2885,7 @@
       <w:tr>
         <w:tc>
           <w:tcPr>
-            <w:tcW w:type="dxa" w:w="2268"/>
+            <w:tcW w:type="dxa" w:w="2254"/>
             <w:shd w:fill="F3F6FA"/>
             <w:vAlign w:val="center"/>
             <w:tcMar>
@@ -2913,7 +2913,7 @@
         </w:tc>
         <w:tc>
           <w:tcPr>
-            <w:tcW w:type="dxa" w:w="1701"/>
+            <w:tcW w:type="dxa" w:w="1691"/>
             <w:shd w:fill="F3F6FA"/>
             <w:vAlign w:val="center"/>
             <w:tcMar>
@@ -2941,7 +2941,7 @@
         </w:tc>
         <w:tc>
           <w:tcPr>
-            <w:tcW w:type="dxa" w:w="5443"/>
+            <w:tcW w:type="dxa" w:w="5410"/>
             <w:shd w:fill="F3F6FA"/>
             <w:vAlign w:val="center"/>
             <w:tcMar>
@@ -2984,7 +2984,7 @@
         <w:tc>
           <w:tcPr>
             <w:tcW w:type="dxa" w:w="5018"/>
-            <w:shd w:fill="E6F4EA"/>
+            <w:shd w:fill="FFF3D6"/>
             <w:vAlign w:val="center"/>
             <w:tcMar>
               <w:top w:w="80" w:type="dxa"/>
@@ -3012,7 +3012,7 @@
         <w:tc>
           <w:tcPr>
             <w:tcW w:type="dxa" w:w="5018"/>
-            <w:shd w:fill="E6F4EA"/>
+            <w:shd w:fill="FFF3D6"/>
             <w:vAlign w:val="center"/>
             <w:tcMar>
               <w:top w:w="80" w:type="dxa"/>
@@ -3033,7 +3033,7 @@
                 <w:color w:val="172033"/>
                 <w:sz w:val="17"/>
               </w:rPr>
-              <w:t>Alur Jurnal Umum → Posting → Laporan berfungsi. Posting otomatis baru dapat dilanjutkan setelah pemetaan akun transaksi sample dilengkapi.</w:t>
+              <w:t>Data sampel kini mengisi seluruh tahap utama dan enam laporan inti. Posting bayar hutang/terima piutang siap; HPP, Penjualan, Kulakan, Tutup Buku, dan endpoint daftar Jurnal Umum masih memiliki temuan yang perlu diperbaiki.</w:t>
             </w:r>
           </w:p>
         </w:tc>
@@ -3465,7 +3465,7 @@
     </w:p>
     <w:p>
       <w:r>
-        <w:t>Periode default adalah bulan berjalan. Daftar menampilkan kode, tanggal, keterangan, total, status, dan aksi.</w:t>
+        <w:t>Daftar menampilkan jurnal contoh beserta kode, tanggal, keterangan, total, status, dan aksi. Bukti ini diambil sebelum restart server; pengujian ulang setelah restart menemukan regresi internal pada endpoint daftar.</w:t>
       </w:r>
     </w:p>
     <w:p>
@@ -3584,7 +3584,7 @@
           <w:color w:val="60708A"/>
           <w:sz w:val="15"/>
         </w:rPr>
-        <w:t>Gambar 3. Daftar Jurnal Umum sebelum data contoh dibuat.</w:t>
+        <w:t>Gambar 3. Daftar Jurnal Umum pada periode uji.</w:t>
       </w:r>
     </w:p>
     <w:p>
@@ -3945,12 +3945,12 @@
         <w:pStyle w:val="Heading1"/>
       </w:pPr>
       <w:r>
-        <w:t>6. Memeriksa draf tersimpan</w:t>
+        <w:t>6. Memeriksa jurnal tersimpan</w:t>
       </w:r>
     </w:p>
     <w:p>
       <w:r>
-        <w:t>UAT menggunakan dua contoh: setoran modal awal dan pemindahan dana kas kecil.</w:t>
+        <w:t>UAT menggunakan dua contoh: setoran modal awal dan pemindahan dana kas kecil. Setelah proses posting, keduanya ditampilkan berstatus Terposting.</w:t>
       </w:r>
     </w:p>
     <w:p>
@@ -3998,7 +3998,7 @@
         <w:t xml:space="preserve">3. </w:t>
       </w:r>
       <w:r>
-        <w:t>Buka menu aksi jika perlu mengoreksi draf.</w:t>
+        <w:t>Sebelum posting, pastikan statusnya Draf; sesudah posting, pastikan statusnya Terposting.</w:t>
       </w:r>
     </w:p>
     <w:p>
@@ -4014,7 +4014,7 @@
         <w:t xml:space="preserve">4. </w:t>
       </w:r>
       <w:r>
-        <w:t>Posting hanya setelah bukti transaksi diperiksa.</w:t>
+        <w:t>Buka menu aksi jika perlu menelusuri rinciannya.</w:t>
       </w:r>
     </w:p>
     <w:p>
@@ -4069,7 +4069,7 @@
           <w:color w:val="60708A"/>
           <w:sz w:val="15"/>
         </w:rPr>
-        <w:t>Gambar 6. Dua jurnal sample masih berstatus Draf.</w:t>
+        <w:t>Gambar 6. Dua jurnal contoh pada periode uji setelah posting.</w:t>
       </w:r>
     </w:p>
     <w:tbl>
@@ -4670,7 +4670,7 @@
           <w:color w:val="60708A"/>
           <w:sz w:val="15"/>
         </w:rPr>
-        <w:t>Gambar 9. Ringkasan Draft Jurnal: 27 draf, 5 terposting, 0 closing.</w:t>
+        <w:t>Gambar 9. Ringkasan Draft Jurnal: 39 draf, 13 terposting, 0 closing, total 52 aktivitas.</w:t>
       </w:r>
     </w:p>
     <w:tbl>
@@ -4736,7 +4736,7 @@
                 <w:color w:val="172033"/>
                 <w:sz w:val="17"/>
               </w:rPr>
-              <w:t>Dua jurnal manual yang baru diposting sudah ikut dihitung pada kolom Terposting.</w:t>
+              <w:t>Delapan jurnal manual terposting, saldo awal, penyesuaian, dan aktivitas lintas modul ikut membentuk ringkasan.</w:t>
             </w:r>
           </w:p>
         </w:tc>
@@ -4762,7 +4762,7 @@
     </w:p>
     <w:p>
       <w:r>
-        <w:t>Pratinjau menemukan satu transaksi ABC Kecap Manis senilai Rp1.200.000, tetapi belum siap karena akun HPP dan persediaan belum diatur.</w:t>
+        <w:t>Pratinjau menemukan satu transaksi ABC Kecap Manis Rp1.200.000. Akun HPP 510.900 sudah terbaca, tetapi akun lawan Persediaan pada Master Aset belum tersedia.</w:t>
       </w:r>
     </w:p>
     <w:p>
@@ -4963,7 +4963,7 @@
                 <w:color w:val="172033"/>
                 <w:sz w:val="17"/>
               </w:rPr>
-              <w:t>Pratinjau menemukan satu transaksi ABC Kecap Manis senilai Rp1.200.000, tetapi belum siap karena akun HPP dan persediaan belum diatur.</w:t>
+              <w:t>Pratinjau menemukan satu transaksi ABC Kecap Manis Rp1.200.000. Akun HPP 510.900 sudah terbaca, tetapi akun lawan Persediaan pada Master Aset belum tersedia.</w:t>
             </w:r>
           </w:p>
         </w:tc>
@@ -4989,7 +4989,7 @@
     </w:p>
     <w:p>
       <w:r>
-        <w:t>Data sample tampil, tetapi prasyarat pemetaan akun masih menahan tombol Posting.</w:t>
+        <w:t>Saat berpindah dari Posting HPP, layar mempertahankan pratinjau HPP. Ini adalah defect state layar; jangan menekan Posting sebelum judul dan isi sama-sama menunjukkan Penjualan.</w:t>
       </w:r>
     </w:p>
     <w:p>
@@ -5190,7 +5190,7 @@
                 <w:color w:val="172033"/>
                 <w:sz w:val="17"/>
               </w:rPr>
-              <w:t>Data sample tampil, tetapi prasyarat pemetaan akun masih menahan tombol Posting.</w:t>
+              <w:t>Saat berpindah dari Posting HPP, layar mempertahankan pratinjau HPP. Ini adalah defect state layar; jangan menekan Posting sebelum judul dan isi sama-sama menunjukkan Penjualan.</w:t>
             </w:r>
           </w:p>
         </w:tc>
@@ -5216,7 +5216,7 @@
     </w:p>
     <w:p>
       <w:r>
-        <w:t>Tidak ada dokumen kulakan belum-posting pada periode uji.</w:t>
+        <w:t>Dua faktur pemasok tampil: Rp600.000 dan Rp450.000. Keduanya belum siap karena akun persediaan Master Aset belum tersedia.</w:t>
       </w:r>
     </w:p>
     <w:p>
@@ -5352,6 +5352,233 @@
           <w:sz w:val="15"/>
         </w:rPr>
         <w:t>Gambar 12. Posting Kulakan.</w:t>
+      </w:r>
+    </w:p>
+    <w:tbl>
+      <w:tblPr>
+        <w:tblW w:type="auto" w:w="0"/>
+        <w:tblLayout w:type="fixed"/>
+        <w:tblLook w:firstColumn="1" w:firstRow="1" w:lastColumn="0" w:lastRow="0" w:noHBand="0" w:noVBand="1" w:val="04A0"/>
+      </w:tblPr>
+      <w:tblGrid>
+        <w:gridCol w:w="1417"/>
+        <w:gridCol w:w="8391"/>
+      </w:tblGrid>
+      <w:tr>
+        <w:tc>
+          <w:tcPr>
+            <w:tcW w:type="dxa" w:w="5018"/>
+            <w:shd w:fill="FFF3D6"/>
+            <w:vAlign w:val="center"/>
+            <w:tcMar>
+              <w:top w:w="80" w:type="dxa"/>
+              <w:start w:w="100" w:type="dxa"/>
+              <w:bottom w:w="80" w:type="dxa"/>
+              <w:end w:w="100" w:type="dxa"/>
+            </w:tcMar>
+          </w:tcPr>
+          <w:p>
+            <w:pPr>
+              <w:spacing w:after="0"/>
+            </w:pPr>
+            <w:r/>
+            <w:r>
+              <w:rPr>
+                <w:rFonts w:ascii="Aptos" w:hAnsi="Aptos"/>
+                <w:b/>
+                <w:color w:val="132238"/>
+                <w:sz w:val="16"/>
+              </w:rPr>
+              <w:t>STATUS UAT</w:t>
+            </w:r>
+          </w:p>
+        </w:tc>
+        <w:tc>
+          <w:tcPr>
+            <w:tcW w:type="dxa" w:w="5018"/>
+            <w:shd w:fill="FFF3D6"/>
+            <w:vAlign w:val="center"/>
+            <w:tcMar>
+              <w:top w:w="80" w:type="dxa"/>
+              <w:start w:w="100" w:type="dxa"/>
+              <w:bottom w:w="80" w:type="dxa"/>
+              <w:end w:w="100" w:type="dxa"/>
+            </w:tcMar>
+          </w:tcPr>
+          <w:p>
+            <w:pPr>
+              <w:spacing w:after="0"/>
+            </w:pPr>
+            <w:r/>
+            <w:r>
+              <w:rPr>
+                <w:rFonts w:ascii="Aptos" w:hAnsi="Aptos"/>
+                <w:b w:val="0"/>
+                <w:color w:val="172033"/>
+                <w:sz w:val="17"/>
+              </w:rPr>
+              <w:t>Dua faktur pemasok tampil: Rp600.000 dan Rp450.000. Keduanya belum siap karena akun persediaan Master Aset belum tersedia.</w:t>
+            </w:r>
+          </w:p>
+        </w:tc>
+      </w:tr>
+    </w:tbl>
+    <w:p>
+      <w:pPr>
+        <w:spacing w:after="0"/>
+      </w:pPr>
+    </w:p>
+    <w:p>
+      <w:r>
+        <w:br w:type="page"/>
+      </w:r>
+    </w:p>
+    <w:p>
+      <w:pPr>
+        <w:pStyle w:val="Heading1"/>
+      </w:pPr>
+      <w:r>
+        <w:t>13. Posting Bayar Hutang</w:t>
+      </w:r>
+    </w:p>
+    <w:p>
+      <w:r>
+        <w:t>Satu pembayaran Rp150.000 siap diposting (Debet 310.600; Kredit 111.101); satu pembayaran Rp200.000 telah diposting saat penyiapan data.</w:t>
+      </w:r>
+    </w:p>
+    <w:p>
+      <w:pPr>
+        <w:spacing w:after="60"/>
+        <w:ind w:left="85" w:hanging="85"/>
+      </w:pPr>
+      <w:r>
+        <w:rPr>
+          <w:b/>
+          <w:color w:val="246B97"/>
+        </w:rPr>
+        <w:t xml:space="preserve">1. </w:t>
+      </w:r>
+      <w:r>
+        <w:t>Pilih periode transaksi.</w:t>
+      </w:r>
+    </w:p>
+    <w:p>
+      <w:pPr>
+        <w:spacing w:after="60"/>
+        <w:ind w:left="85" w:hanging="85"/>
+      </w:pPr>
+      <w:r>
+        <w:rPr>
+          <w:b/>
+          <w:color w:val="246B97"/>
+        </w:rPr>
+        <w:t xml:space="preserve">2. </w:t>
+      </w:r>
+      <w:r>
+        <w:t>Klik Muat ulang/Pratinjau.</w:t>
+      </w:r>
+    </w:p>
+    <w:p>
+      <w:pPr>
+        <w:spacing w:after="60"/>
+        <w:ind w:left="85" w:hanging="85"/>
+      </w:pPr>
+      <w:r>
+        <w:rPr>
+          <w:b/>
+          <w:color w:val="246B97"/>
+        </w:rPr>
+        <w:t xml:space="preserve">3. </w:t>
+      </w:r>
+      <w:r>
+        <w:t>Periksa baris yang siap dan alasan baris tertahan.</w:t>
+      </w:r>
+    </w:p>
+    <w:p>
+      <w:pPr>
+        <w:spacing w:after="60"/>
+        <w:ind w:left="85" w:hanging="85"/>
+      </w:pPr>
+      <w:r>
+        <w:rPr>
+          <w:b/>
+          <w:color w:val="246B97"/>
+        </w:rPr>
+        <w:t xml:space="preserve">4. </w:t>
+      </w:r>
+      <w:r>
+        <w:t>Lengkapi pemetaan akun bila diperlukan.</w:t>
+      </w:r>
+    </w:p>
+    <w:p>
+      <w:pPr>
+        <w:spacing w:after="60"/>
+        <w:ind w:left="85" w:hanging="85"/>
+      </w:pPr>
+      <w:r>
+        <w:rPr>
+          <w:b/>
+          <w:color w:val="246B97"/>
+        </w:rPr>
+        <w:t xml:space="preserve">5. </w:t>
+      </w:r>
+      <w:r>
+        <w:t>Posting hanya baris yang siap.</w:t>
+      </w:r>
+    </w:p>
+    <w:p>
+      <w:pPr>
+        <w:spacing w:before="80" w:after="60"/>
+        <w:jc w:val="center"/>
+      </w:pPr>
+      <w:r>
+        <w:drawing>
+          <wp:inline xmlns:a="http://schemas.openxmlformats.org/drawingml/2006/main" xmlns:pic="http://schemas.openxmlformats.org/drawingml/2006/picture">
+            <wp:extent cx="6126480" cy="3300738"/>
+            <wp:docPr id="14" name="Picture 14"/>
+            <wp:cNvGraphicFramePr>
+              <a:graphicFrameLocks noChangeAspect="1"/>
+            </wp:cNvGraphicFramePr>
+            <a:graphic>
+              <a:graphicData uri="http://schemas.openxmlformats.org/drawingml/2006/picture">
+                <pic:pic>
+                  <pic:nvPicPr>
+                    <pic:cNvPr id="0" name="12-posting-bayar-hutang.png"/>
+                    <pic:cNvPicPr/>
+                  </pic:nvPicPr>
+                  <pic:blipFill>
+                    <a:blip r:embed="rId21"/>
+                    <a:stretch>
+                      <a:fillRect/>
+                    </a:stretch>
+                  </pic:blipFill>
+                  <pic:spPr>
+                    <a:xfrm>
+                      <a:off x="0" y="0"/>
+                      <a:ext cx="6126480" cy="3300738"/>
+                    </a:xfrm>
+                    <a:prstGeom prst="rect"/>
+                  </pic:spPr>
+                </pic:pic>
+              </a:graphicData>
+            </a:graphic>
+          </wp:inline>
+        </w:drawing>
+      </w:r>
+    </w:p>
+    <w:p>
+      <w:pPr>
+        <w:spacing w:after="100"/>
+        <w:jc w:val="center"/>
+      </w:pPr>
+      <w:r>
+        <w:rPr>
+          <w:rFonts w:ascii="Aptos" w:hAnsi="Aptos"/>
+          <w:i/>
+          <w:color w:val="60708A"/>
+          <w:sz w:val="15"/>
+        </w:rPr>
+        <w:t>Gambar 13. Posting Bayar Hutang.</w:t>
       </w:r>
     </w:p>
     <w:tbl>
@@ -5417,7 +5644,7 @@
                 <w:color w:val="172033"/>
                 <w:sz w:val="17"/>
               </w:rPr>
-              <w:t>Tidak ada dokumen kulakan belum-posting pada periode uji.</w:t>
+              <w:t>Satu pembayaran Rp150.000 siap diposting (Debet 310.600; Kredit 111.101); satu pembayaran Rp200.000 telah diposting saat penyiapan data.</w:t>
             </w:r>
           </w:p>
         </w:tc>
@@ -5438,12 +5665,12 @@
         <w:pStyle w:val="Heading1"/>
       </w:pPr>
       <w:r>
-        <w:t>13. Posting Bayar Hutang</w:t>
+        <w:t>14. Posting Terima Piutang</w:t>
       </w:r>
     </w:p>
     <w:p>
       <w:r>
-        <w:t>Tidak ada pembayaran hutang belum-posting pada periode uji.</w:t>
+        <w:t>Satu penerimaan Rp200.000 siap diposting (Debet 111.101; Kredit 131.300); satu penerimaan Rp175.000 telah diposting saat penyiapan data.</w:t>
       </w:r>
     </w:p>
     <w:p>
@@ -5535,7 +5762,7 @@
         <w:drawing>
           <wp:inline xmlns:a="http://schemas.openxmlformats.org/drawingml/2006/main" xmlns:pic="http://schemas.openxmlformats.org/drawingml/2006/picture">
             <wp:extent cx="6126480" cy="3300738"/>
-            <wp:docPr id="14" name="Picture 14"/>
+            <wp:docPr id="15" name="Picture 15"/>
             <wp:cNvGraphicFramePr>
               <a:graphicFrameLocks noChangeAspect="1"/>
             </wp:cNvGraphicFramePr>
@@ -5543,11 +5770,11 @@
               <a:graphicData uri="http://schemas.openxmlformats.org/drawingml/2006/picture">
                 <pic:pic>
                   <pic:nvPicPr>
-                    <pic:cNvPr id="0" name="12-posting-bayar-hutang.png"/>
+                    <pic:cNvPr id="0" name="13-posting-terima-piutang.png"/>
                     <pic:cNvPicPr/>
                   </pic:nvPicPr>
                   <pic:blipFill>
-                    <a:blip r:embed="rId21"/>
+                    <a:blip r:embed="rId22"/>
                     <a:stretch>
                       <a:fillRect/>
                     </a:stretch>
@@ -5578,7 +5805,7 @@
           <w:color w:val="60708A"/>
           <w:sz w:val="15"/>
         </w:rPr>
-        <w:t>Gambar 13. Posting Bayar Hutang.</w:t>
+        <w:t>Gambar 14. Posting Terima Piutang.</w:t>
       </w:r>
     </w:p>
     <w:tbl>
@@ -5644,7 +5871,7 @@
                 <w:color w:val="172033"/>
                 <w:sz w:val="17"/>
               </w:rPr>
-              <w:t>Tidak ada pembayaran hutang belum-posting pada periode uji.</w:t>
+              <w:t>Satu penerimaan Rp200.000 siap diposting (Debet 111.101; Kredit 131.300); satu penerimaan Rp175.000 telah diposting saat penyiapan data.</w:t>
             </w:r>
           </w:p>
         </w:tc>
@@ -5665,12 +5892,12 @@
         <w:pStyle w:val="Heading1"/>
       </w:pPr>
       <w:r>
-        <w:t>14. Posting Terima Piutang</w:t>
+        <w:t>15. Saldo Awal (Neraca Awal)</w:t>
       </w:r>
     </w:p>
     <w:p>
       <w:r>
-        <w:t>Tidak ada penerimaan piutang belum-posting pada periode uji.</w:t>
+        <w:t>Lima akun pembukaan telah diposting: kas, persediaan, piutang, utang, dan modal. Total Debet dan Kredit masing-masing Rp22.000.000.</w:t>
       </w:r>
     </w:p>
     <w:p>
@@ -5686,234 +5913,7 @@
         <w:t xml:space="preserve">1. </w:t>
       </w:r>
       <w:r>
-        <w:t>Pilih periode transaksi.</w:t>
-      </w:r>
-    </w:p>
-    <w:p>
-      <w:pPr>
-        <w:spacing w:after="60"/>
-        <w:ind w:left="85" w:hanging="85"/>
-      </w:pPr>
-      <w:r>
-        <w:rPr>
-          <w:b/>
-          <w:color w:val="246B97"/>
-        </w:rPr>
-        <w:t xml:space="preserve">2. </w:t>
-      </w:r>
-      <w:r>
-        <w:t>Klik Muat ulang/Pratinjau.</w:t>
-      </w:r>
-    </w:p>
-    <w:p>
-      <w:pPr>
-        <w:spacing w:after="60"/>
-        <w:ind w:left="85" w:hanging="85"/>
-      </w:pPr>
-      <w:r>
-        <w:rPr>
-          <w:b/>
-          <w:color w:val="246B97"/>
-        </w:rPr>
-        <w:t xml:space="preserve">3. </w:t>
-      </w:r>
-      <w:r>
-        <w:t>Periksa baris yang siap dan alasan baris tertahan.</w:t>
-      </w:r>
-    </w:p>
-    <w:p>
-      <w:pPr>
-        <w:spacing w:after="60"/>
-        <w:ind w:left="85" w:hanging="85"/>
-      </w:pPr>
-      <w:r>
-        <w:rPr>
-          <w:b/>
-          <w:color w:val="246B97"/>
-        </w:rPr>
-        <w:t xml:space="preserve">4. </w:t>
-      </w:r>
-      <w:r>
-        <w:t>Lengkapi pemetaan akun bila diperlukan.</w:t>
-      </w:r>
-    </w:p>
-    <w:p>
-      <w:pPr>
-        <w:spacing w:after="60"/>
-        <w:ind w:left="85" w:hanging="85"/>
-      </w:pPr>
-      <w:r>
-        <w:rPr>
-          <w:b/>
-          <w:color w:val="246B97"/>
-        </w:rPr>
-        <w:t xml:space="preserve">5. </w:t>
-      </w:r>
-      <w:r>
-        <w:t>Posting hanya baris yang siap.</w:t>
-      </w:r>
-    </w:p>
-    <w:p>
-      <w:pPr>
-        <w:spacing w:before="80" w:after="60"/>
-        <w:jc w:val="center"/>
-      </w:pPr>
-      <w:r>
-        <w:drawing>
-          <wp:inline xmlns:a="http://schemas.openxmlformats.org/drawingml/2006/main" xmlns:pic="http://schemas.openxmlformats.org/drawingml/2006/picture">
-            <wp:extent cx="6126480" cy="3300738"/>
-            <wp:docPr id="15" name="Picture 15"/>
-            <wp:cNvGraphicFramePr>
-              <a:graphicFrameLocks noChangeAspect="1"/>
-            </wp:cNvGraphicFramePr>
-            <a:graphic>
-              <a:graphicData uri="http://schemas.openxmlformats.org/drawingml/2006/picture">
-                <pic:pic>
-                  <pic:nvPicPr>
-                    <pic:cNvPr id="0" name="13-posting-terima-piutang.png"/>
-                    <pic:cNvPicPr/>
-                  </pic:nvPicPr>
-                  <pic:blipFill>
-                    <a:blip r:embed="rId22"/>
-                    <a:stretch>
-                      <a:fillRect/>
-                    </a:stretch>
-                  </pic:blipFill>
-                  <pic:spPr>
-                    <a:xfrm>
-                      <a:off x="0" y="0"/>
-                      <a:ext cx="6126480" cy="3300738"/>
-                    </a:xfrm>
-                    <a:prstGeom prst="rect"/>
-                  </pic:spPr>
-                </pic:pic>
-              </a:graphicData>
-            </a:graphic>
-          </wp:inline>
-        </w:drawing>
-      </w:r>
-    </w:p>
-    <w:p>
-      <w:pPr>
-        <w:spacing w:after="100"/>
-        <w:jc w:val="center"/>
-      </w:pPr>
-      <w:r>
-        <w:rPr>
-          <w:rFonts w:ascii="Aptos" w:hAnsi="Aptos"/>
-          <w:i/>
-          <w:color w:val="60708A"/>
-          <w:sz w:val="15"/>
-        </w:rPr>
-        <w:t>Gambar 14. Posting Terima Piutang.</w:t>
-      </w:r>
-    </w:p>
-    <w:tbl>
-      <w:tblPr>
-        <w:tblW w:type="auto" w:w="0"/>
-        <w:tblLayout w:type="fixed"/>
-        <w:tblLook w:firstColumn="1" w:firstRow="1" w:lastColumn="0" w:lastRow="0" w:noHBand="0" w:noVBand="1" w:val="04A0"/>
-      </w:tblPr>
-      <w:tblGrid>
-        <w:gridCol w:w="1417"/>
-        <w:gridCol w:w="8391"/>
-      </w:tblGrid>
-      <w:tr>
-        <w:tc>
-          <w:tcPr>
-            <w:tcW w:type="dxa" w:w="5018"/>
-            <w:shd w:fill="DCEEF8"/>
-            <w:vAlign w:val="center"/>
-            <w:tcMar>
-              <w:top w:w="80" w:type="dxa"/>
-              <w:start w:w="100" w:type="dxa"/>
-              <w:bottom w:w="80" w:type="dxa"/>
-              <w:end w:w="100" w:type="dxa"/>
-            </w:tcMar>
-          </w:tcPr>
-          <w:p>
-            <w:pPr>
-              <w:spacing w:after="0"/>
-            </w:pPr>
-            <w:r/>
-            <w:r>
-              <w:rPr>
-                <w:rFonts w:ascii="Aptos" w:hAnsi="Aptos"/>
-                <w:b/>
-                <w:color w:val="132238"/>
-                <w:sz w:val="16"/>
-              </w:rPr>
-              <w:t>STATUS UAT</w:t>
-            </w:r>
-          </w:p>
-        </w:tc>
-        <w:tc>
-          <w:tcPr>
-            <w:tcW w:type="dxa" w:w="5018"/>
-            <w:shd w:fill="DCEEF8"/>
-            <w:vAlign w:val="center"/>
-            <w:tcMar>
-              <w:top w:w="80" w:type="dxa"/>
-              <w:start w:w="100" w:type="dxa"/>
-              <w:bottom w:w="80" w:type="dxa"/>
-              <w:end w:w="100" w:type="dxa"/>
-            </w:tcMar>
-          </w:tcPr>
-          <w:p>
-            <w:pPr>
-              <w:spacing w:after="0"/>
-            </w:pPr>
-            <w:r/>
-            <w:r>
-              <w:rPr>
-                <w:rFonts w:ascii="Aptos" w:hAnsi="Aptos"/>
-                <w:b w:val="0"/>
-                <w:color w:val="172033"/>
-                <w:sz w:val="17"/>
-              </w:rPr>
-              <w:t>Tidak ada penerimaan piutang belum-posting pada periode uji.</w:t>
-            </w:r>
-          </w:p>
-        </w:tc>
-      </w:tr>
-    </w:tbl>
-    <w:p>
-      <w:pPr>
-        <w:spacing w:after="0"/>
-      </w:pPr>
-    </w:p>
-    <w:p>
-      <w:r>
-        <w:br w:type="page"/>
-      </w:r>
-    </w:p>
-    <w:p>
-      <w:pPr>
-        <w:pStyle w:val="Heading1"/>
-      </w:pPr>
-      <w:r>
-        <w:t>15. Saldo Awal (Neraca Awal)</w:t>
-      </w:r>
-    </w:p>
-    <w:p>
-      <w:r>
-        <w:t>Tambahkan saldo pembukaan per akun atau unggah Excel. Pastikan total Debet dan Kredit seimbang sebelum Posting Jurnal Pembukaan.</w:t>
-      </w:r>
-    </w:p>
-    <w:p>
-      <w:pPr>
-        <w:spacing w:after="60"/>
-        <w:ind w:left="85" w:hanging="85"/>
-      </w:pPr>
-      <w:r>
-        <w:rPr>
-          <w:b/>
-          <w:color w:val="246B97"/>
-        </w:rPr>
-        <w:t xml:space="preserve">1. </w:t>
-      </w:r>
-      <w:r>
-        <w:t>Pilih submenu terkait.</w:t>
+        <w:t>Buka submenu yang diperlukan.</w:t>
       </w:r>
     </w:p>
     <w:p>
@@ -6016,7 +6016,7 @@
           <w:color w:val="60708A"/>
           <w:sz w:val="15"/>
         </w:rPr>
-        <w:t>Gambar 15. Daftar saldo awal akun.</w:t>
+        <w:t>Gambar 15. Lima saldo awal telah diposting.</w:t>
       </w:r>
     </w:p>
     <w:tbl>
@@ -6108,7 +6108,7 @@
     </w:p>
     <w:p>
       <w:r>
-        <w:t>Buat template untuk amortisasi, akrual, penyisihan, atau jurnal periodik lain; lalu posting per periode.</w:t>
+        <w:t>Tiga template sampel tersedia untuk listrik/internet Rp350.000, sewa outlet Rp500.000, dan cadangan kerugian piutang Rp100.000; jurnal periode September telah diposting.</w:t>
       </w:r>
     </w:p>
     <w:p>
@@ -6124,7 +6124,7 @@
         <w:t xml:space="preserve">1. </w:t>
       </w:r>
       <w:r>
-        <w:t>Pilih submenu terkait.</w:t>
+        <w:t>Buka submenu yang diperlukan.</w:t>
       </w:r>
     </w:p>
     <w:p>
@@ -6319,7 +6319,7 @@
     </w:p>
     <w:p>
       <w:r>
-        <w:t>Gunakan Lihat Draf untuk meninjau akun laba/rugi dan sisi penutupnya sebelum menekan Tutup Buku.</w:t>
+        <w:t>Gunakan Lihat Draf untuk meninjau akun laba/rugi dan sisi penutupnya. UAT menemukan pesan Laba Ditahan belum diatur walau toko sudah mempunyai pemetaan; aksi final tidak dijalankan.</w:t>
       </w:r>
     </w:p>
     <w:p>
@@ -6335,7 +6335,7 @@
         <w:t xml:space="preserve">1. </w:t>
       </w:r>
       <w:r>
-        <w:t>Pilih submenu terkait.</w:t>
+        <w:t>Buka submenu yang diperlukan.</w:t>
       </w:r>
     </w:p>
     <w:p>
@@ -6530,7 +6530,7 @@
     </w:p>
     <w:p>
       <w:r>
-        <w:t>Closing menautkan jurnal sampai tanggal batas dan mencegah pembatalan posting. UAT tidak mengeksekusi aksi final pada database demo bersama.</w:t>
+        <w:t>Form Closing Baru berhasil dibuka. Closing menautkan jurnal sampai tanggal batas dan mencegah pembatalan posting; formulir ditutup tanpa menyimpan pada database demo bersama.</w:t>
       </w:r>
     </w:p>
     <w:p>
@@ -6546,7 +6546,7 @@
         <w:t xml:space="preserve">1. </w:t>
       </w:r>
       <w:r>
-        <w:t>Pilih submenu terkait.</w:t>
+        <w:t>Buka submenu yang diperlukan.</w:t>
       </w:r>
     </w:p>
     <w:p>
@@ -6649,7 +6649,7 @@
           <w:color w:val="60708A"/>
           <w:sz w:val="15"/>
         </w:rPr>
-        <w:t>Gambar 18. Daftar periode Closing.</w:t>
+        <w:t>Gambar 18. Form Closing Baru.</w:t>
       </w:r>
     </w:p>
     <w:tbl>
@@ -7071,7 +7071,7 @@
           <w:color w:val="60708A"/>
           <w:sz w:val="15"/>
         </w:rPr>
-        <w:t>Gambar 20. RAB Bulanan pada tahun 2025.</w:t>
+        <w:t>Gambar 20. Tiga item RAB Bulanan dengan total rencana Rp45.000.000.</w:t>
       </w:r>
     </w:p>
     <w:tbl>
@@ -7282,7 +7282,7 @@
           <w:color w:val="60708A"/>
           <w:sz w:val="15"/>
         </w:rPr>
-        <w:t>Gambar 21. Bagan akun sample—311 akun dalam 21 halaman.</w:t>
+        <w:t>Gambar 21. Bagan akun sample—317 akun.</w:t>
       </w:r>
     </w:p>
     <w:tbl>
@@ -8007,7 +8007,7 @@
     </w:p>
     <w:p>
       <w:r>
-        <w:t>Delapan endpoint laporan diuji untuk periode 1–4 September 2026. Semua memberi status sukses. Enam laporan inti berikut juga dirender di aplikasi dan tombol PDF/Excel diverifikasi aktif.</w:t>
+        <w:t>Enam laporan inti diuji ulang untuk periode 1–30 September 2026 setelah 256 akun lama ditautkan ke Kelompok Laporan melalui pemetaan standar aplikasi. Semua layar memuat dan tombol PDF/Excel aktif.</w:t>
       </w:r>
     </w:p>
     <w:tbl>
@@ -8018,10 +8018,9 @@
         <w:tblLook w:firstColumn="1" w:firstRow="1" w:lastColumn="0" w:lastRow="0" w:noHBand="0" w:noVBand="1" w:val="04A0"/>
       </w:tblPr>
       <w:tblGrid>
-        <w:gridCol w:w="5102"/>
-        <w:gridCol w:w="1134"/>
-        <w:gridCol w:w="1134"/>
-        <w:gridCol w:w="2041"/>
+        <w:gridCol w:w="2423"/>
+        <w:gridCol w:w="5522"/>
+        <w:gridCol w:w="1409"/>
       </w:tblGrid>
       <w:tr>
         <w:trPr>
@@ -8029,7 +8028,7 @@
         </w:trPr>
         <w:tc>
           <w:tcPr>
-            <w:tcW w:type="dxa" w:w="2509"/>
+            <w:tcW w:type="dxa" w:w="2423"/>
             <w:shd w:fill="132238"/>
             <w:vAlign w:val="center"/>
             <w:tcMar>
@@ -8057,7 +8056,7 @@
         </w:tc>
         <w:tc>
           <w:tcPr>
-            <w:tcW w:type="dxa" w:w="2509"/>
+            <w:tcW w:type="dxa" w:w="5522"/>
             <w:shd w:fill="132238"/>
             <w:vAlign w:val="center"/>
             <w:tcMar>
@@ -8079,41 +8078,13 @@
                 <w:color w:val="FFFFFF"/>
                 <w:sz w:val="16"/>
               </w:rPr>
-              <w:t>Kolom</w:t>
+              <w:t>Bukti data sampel</w:t>
             </w:r>
           </w:p>
         </w:tc>
         <w:tc>
           <w:tcPr>
-            <w:tcW w:type="dxa" w:w="2509"/>
-            <w:shd w:fill="132238"/>
-            <w:vAlign w:val="center"/>
-            <w:tcMar>
-              <w:top w:w="80" w:type="dxa"/>
-              <w:start w:w="100" w:type="dxa"/>
-              <w:bottom w:w="80" w:type="dxa"/>
-              <w:end w:w="100" w:type="dxa"/>
-            </w:tcMar>
-          </w:tcPr>
-          <w:p>
-            <w:pPr>
-              <w:spacing w:after="0"/>
-            </w:pPr>
-            <w:r/>
-            <w:r>
-              <w:rPr>
-                <w:rFonts w:ascii="Aptos" w:hAnsi="Aptos"/>
-                <w:b/>
-                <w:color w:val="FFFFFF"/>
-                <w:sz w:val="16"/>
-              </w:rPr>
-              <w:t>Baris</w:t>
-            </w:r>
-          </w:p>
-        </w:tc>
-        <w:tc>
-          <w:tcPr>
-            <w:tcW w:type="dxa" w:w="2509"/>
+            <w:tcW w:type="dxa" w:w="1409"/>
             <w:shd w:fill="132238"/>
             <w:vAlign w:val="center"/>
             <w:tcMar>
@@ -8143,7 +8114,7 @@
       <w:tr>
         <w:tc>
           <w:tcPr>
-            <w:tcW w:type="dxa" w:w="5102"/>
+            <w:tcW w:type="dxa" w:w="2423"/>
             <w:shd w:fill="F3F6FA"/>
             <w:vAlign w:val="center"/>
             <w:tcMar>
@@ -8165,13 +8136,13 @@
                 <w:color w:val="172033"/>
                 <w:sz w:val="15"/>
               </w:rPr>
-              <w:t>Laba Rugi (berbasis jurnal)</w:t>
+              <w:t>Laba Rugi</w:t>
             </w:r>
           </w:p>
         </w:tc>
         <w:tc>
           <w:tcPr>
-            <w:tcW w:type="dxa" w:w="1134"/>
+            <w:tcW w:type="dxa" w:w="5522"/>
             <w:shd w:fill="F3F6FA"/>
             <w:vAlign w:val="center"/>
             <w:tcMar>
@@ -8193,41 +8164,13 @@
                 <w:color w:val="172033"/>
                 <w:sz w:val="15"/>
               </w:rPr>
-              <w:t>2</w:t>
+              <w:t>Pendapatan Rp4.750.000; beban berasal dari HPP, listrik, sewa, dan penyisihan.</w:t>
             </w:r>
           </w:p>
         </w:tc>
         <w:tc>
           <w:tcPr>
-            <w:tcW w:type="dxa" w:w="1134"/>
-            <w:shd w:fill="F3F6FA"/>
-            <w:vAlign w:val="center"/>
-            <w:tcMar>
-              <w:top w:w="80" w:type="dxa"/>
-              <w:start w:w="100" w:type="dxa"/>
-              <w:bottom w:w="80" w:type="dxa"/>
-              <w:end w:w="100" w:type="dxa"/>
-            </w:tcMar>
-          </w:tcPr>
-          <w:p>
-            <w:pPr>
-              <w:spacing w:after="0"/>
-            </w:pPr>
-            <w:r/>
-            <w:r>
-              <w:rPr>
-                <w:rFonts w:ascii="Aptos" w:hAnsi="Aptos"/>
-                <w:b w:val="0"/>
-                <w:color w:val="172033"/>
-                <w:sz w:val="15"/>
-              </w:rPr>
-              <w:t>1</w:t>
-            </w:r>
-          </w:p>
-        </w:tc>
-        <w:tc>
-          <w:tcPr>
-            <w:tcW w:type="dxa" w:w="2041"/>
+            <w:tcW w:type="dxa" w:w="1409"/>
             <w:shd w:fill="F3F6FA"/>
             <w:vAlign w:val="center"/>
             <w:tcMar>
@@ -8257,7 +8200,7 @@
       <w:tr>
         <w:tc>
           <w:tcPr>
-            <w:tcW w:type="dxa" w:w="5102"/>
+            <w:tcW w:type="dxa" w:w="2423"/>
             <w:vAlign w:val="center"/>
             <w:tcMar>
               <w:top w:w="80" w:type="dxa"/>
@@ -8278,13 +8221,13 @@
                 <w:color w:val="172033"/>
                 <w:sz w:val="15"/>
               </w:rPr>
-              <w:t>Neraca (berbasis jurnal)</w:t>
+              <w:t>Neraca</w:t>
             </w:r>
           </w:p>
         </w:tc>
         <w:tc>
           <w:tcPr>
-            <w:tcW w:type="dxa" w:w="1134"/>
+            <w:tcW w:type="dxa" w:w="5522"/>
             <w:vAlign w:val="center"/>
             <w:tcMar>
               <w:top w:w="80" w:type="dxa"/>
@@ -8305,40 +8248,13 @@
                 <w:color w:val="172033"/>
                 <w:sz w:val="15"/>
               </w:rPr>
-              <w:t>2</w:t>
+              <w:t>Kas Yayasan Rp18.025.000 serta akun aset/kewajiban/modal lain tampil terkelompok.</w:t>
             </w:r>
           </w:p>
         </w:tc>
         <w:tc>
           <w:tcPr>
-            <w:tcW w:type="dxa" w:w="1134"/>
-            <w:vAlign w:val="center"/>
-            <w:tcMar>
-              <w:top w:w="80" w:type="dxa"/>
-              <w:start w:w="100" w:type="dxa"/>
-              <w:bottom w:w="80" w:type="dxa"/>
-              <w:end w:w="100" w:type="dxa"/>
-            </w:tcMar>
-          </w:tcPr>
-          <w:p>
-            <w:pPr>
-              <w:spacing w:after="0"/>
-            </w:pPr>
-            <w:r/>
-            <w:r>
-              <w:rPr>
-                <w:rFonts w:ascii="Aptos" w:hAnsi="Aptos"/>
-                <w:b w:val="0"/>
-                <w:color w:val="172033"/>
-                <w:sz w:val="15"/>
-              </w:rPr>
-              <w:t>15</w:t>
-            </w:r>
-          </w:p>
-        </w:tc>
-        <w:tc>
-          <w:tcPr>
-            <w:tcW w:type="dxa" w:w="2041"/>
+            <w:tcW w:type="dxa" w:w="1409"/>
             <w:vAlign w:val="center"/>
             <w:tcMar>
               <w:top w:w="80" w:type="dxa"/>
@@ -8367,7 +8283,7 @@
       <w:tr>
         <w:tc>
           <w:tcPr>
-            <w:tcW w:type="dxa" w:w="5102"/>
+            <w:tcW w:type="dxa" w:w="2423"/>
             <w:shd w:fill="F3F6FA"/>
             <w:vAlign w:val="center"/>
             <w:tcMar>
@@ -8389,13 +8305,13 @@
                 <w:color w:val="172033"/>
                 <w:sz w:val="15"/>
               </w:rPr>
-              <w:t>Arus Kas (berbasis jurnal)</w:t>
+              <w:t>Arus Kas</w:t>
             </w:r>
           </w:p>
         </w:tc>
         <w:tc>
           <w:tcPr>
-            <w:tcW w:type="dxa" w:w="1134"/>
+            <w:tcW w:type="dxa" w:w="5522"/>
             <w:shd w:fill="F3F6FA"/>
             <w:vAlign w:val="center"/>
             <w:tcMar>
@@ -8417,41 +8333,13 @@
                 <w:color w:val="172033"/>
                 <w:sz w:val="15"/>
               </w:rPr>
-              <w:t>2</w:t>
+              <w:t>Saldo awal kas/bank Rp12.900.000; penerimaan terlihat Rp3.100.000.</w:t>
             </w:r>
           </w:p>
         </w:tc>
         <w:tc>
           <w:tcPr>
-            <w:tcW w:type="dxa" w:w="1134"/>
-            <w:shd w:fill="F3F6FA"/>
-            <w:vAlign w:val="center"/>
-            <w:tcMar>
-              <w:top w:w="80" w:type="dxa"/>
-              <w:start w:w="100" w:type="dxa"/>
-              <w:bottom w:w="80" w:type="dxa"/>
-              <w:end w:w="100" w:type="dxa"/>
-            </w:tcMar>
-          </w:tcPr>
-          <w:p>
-            <w:pPr>
-              <w:spacing w:after="0"/>
-            </w:pPr>
-            <w:r/>
-            <w:r>
-              <w:rPr>
-                <w:rFonts w:ascii="Aptos" w:hAnsi="Aptos"/>
-                <w:b w:val="0"/>
-                <w:color w:val="172033"/>
-                <w:sz w:val="15"/>
-              </w:rPr>
-              <w:t>13</w:t>
-            </w:r>
-          </w:p>
-        </w:tc>
-        <w:tc>
-          <w:tcPr>
-            <w:tcW w:type="dxa" w:w="2041"/>
+            <w:tcW w:type="dxa" w:w="1409"/>
             <w:shd w:fill="F3F6FA"/>
             <w:vAlign w:val="center"/>
             <w:tcMar>
@@ -8481,7 +8369,7 @@
       <w:tr>
         <w:tc>
           <w:tcPr>
-            <w:tcW w:type="dxa" w:w="5102"/>
+            <w:tcW w:type="dxa" w:w="2423"/>
             <w:vAlign w:val="center"/>
             <w:tcMar>
               <w:top w:w="80" w:type="dxa"/>
@@ -8502,13 +8390,13 @@
                 <w:color w:val="172033"/>
                 <w:sz w:val="15"/>
               </w:rPr>
-              <w:t>Laporan Aktivitas</w:t>
+              <w:t>Keseluruhan Jurnal</w:t>
             </w:r>
           </w:p>
         </w:tc>
         <w:tc>
           <w:tcPr>
-            <w:tcW w:type="dxa" w:w="1134"/>
+            <w:tcW w:type="dxa" w:w="5522"/>
             <w:vAlign w:val="center"/>
             <w:tcMar>
               <w:top w:w="80" w:type="dxa"/>
@@ -8529,40 +8417,13 @@
                 <w:color w:val="172033"/>
                 <w:sz w:val="15"/>
               </w:rPr>
-              <w:t>2</w:t>
+              <w:t>JU/09/00001 s.d. JU/09/00008 dapat ditelusuri per baris.</w:t>
             </w:r>
           </w:p>
         </w:tc>
         <w:tc>
           <w:tcPr>
-            <w:tcW w:type="dxa" w:w="1134"/>
-            <w:vAlign w:val="center"/>
-            <w:tcMar>
-              <w:top w:w="80" w:type="dxa"/>
-              <w:start w:w="100" w:type="dxa"/>
-              <w:bottom w:w="80" w:type="dxa"/>
-              <w:end w:w="100" w:type="dxa"/>
-            </w:tcMar>
-          </w:tcPr>
-          <w:p>
-            <w:pPr>
-              <w:spacing w:after="0"/>
-            </w:pPr>
-            <w:r/>
-            <w:r>
-              <w:rPr>
-                <w:rFonts w:ascii="Aptos" w:hAnsi="Aptos"/>
-                <w:b w:val="0"/>
-                <w:color w:val="172033"/>
-                <w:sz w:val="15"/>
-              </w:rPr>
-              <w:t>1</w:t>
-            </w:r>
-          </w:p>
-        </w:tc>
-        <w:tc>
-          <w:tcPr>
-            <w:tcW w:type="dxa" w:w="2041"/>
+            <w:tcW w:type="dxa" w:w="1409"/>
             <w:vAlign w:val="center"/>
             <w:tcMar>
               <w:top w:w="80" w:type="dxa"/>
@@ -8591,7 +8452,7 @@
       <w:tr>
         <w:tc>
           <w:tcPr>
-            <w:tcW w:type="dxa" w:w="5102"/>
+            <w:tcW w:type="dxa" w:w="2423"/>
             <w:shd w:fill="F3F6FA"/>
             <w:vAlign w:val="center"/>
             <w:tcMar>
@@ -8613,13 +8474,13 @@
                 <w:color w:val="172033"/>
                 <w:sz w:val="15"/>
               </w:rPr>
-              <w:t>Keseluruhan Jurnal</w:t>
+              <w:t>Buku Besar</w:t>
             </w:r>
           </w:p>
         </w:tc>
         <w:tc>
           <w:tcPr>
-            <w:tcW w:type="dxa" w:w="1134"/>
+            <w:tcW w:type="dxa" w:w="5522"/>
             <w:shd w:fill="F3F6FA"/>
             <w:vAlign w:val="center"/>
             <w:tcMar>
@@ -8641,41 +8502,13 @@
                 <w:color w:val="172033"/>
                 <w:sz w:val="15"/>
               </w:rPr>
-              <w:t>7</w:t>
+              <w:t>Mutasi Kas Yayasan dan akun lawan tampil per nomor jurnal.</w:t>
             </w:r>
           </w:p>
         </w:tc>
         <w:tc>
           <w:tcPr>
-            <w:tcW w:type="dxa" w:w="1134"/>
-            <w:shd w:fill="F3F6FA"/>
-            <w:vAlign w:val="center"/>
-            <w:tcMar>
-              <w:top w:w="80" w:type="dxa"/>
-              <w:start w:w="100" w:type="dxa"/>
-              <w:bottom w:w="80" w:type="dxa"/>
-              <w:end w:w="100" w:type="dxa"/>
-            </w:tcMar>
-          </w:tcPr>
-          <w:p>
-            <w:pPr>
-              <w:spacing w:after="0"/>
-            </w:pPr>
-            <w:r/>
-            <w:r>
-              <w:rPr>
-                <w:rFonts w:ascii="Aptos" w:hAnsi="Aptos"/>
-                <w:b w:val="0"/>
-                <w:color w:val="172033"/>
-                <w:sz w:val="15"/>
-              </w:rPr>
-              <w:t>4</w:t>
-            </w:r>
-          </w:p>
-        </w:tc>
-        <w:tc>
-          <w:tcPr>
-            <w:tcW w:type="dxa" w:w="2041"/>
+            <w:tcW w:type="dxa" w:w="1409"/>
             <w:shd w:fill="F3F6FA"/>
             <w:vAlign w:val="center"/>
             <w:tcMar>
@@ -8705,118 +8538,7 @@
       <w:tr>
         <w:tc>
           <w:tcPr>
-            <w:tcW w:type="dxa" w:w="5102"/>
-            <w:vAlign w:val="center"/>
-            <w:tcMar>
-              <w:top w:w="80" w:type="dxa"/>
-              <w:start w:w="100" w:type="dxa"/>
-              <w:bottom w:w="80" w:type="dxa"/>
-              <w:end w:w="100" w:type="dxa"/>
-            </w:tcMar>
-          </w:tcPr>
-          <w:p>
-            <w:pPr>
-              <w:spacing w:after="0"/>
-            </w:pPr>
-            <w:r/>
-            <w:r>
-              <w:rPr>
-                <w:rFonts w:ascii="Aptos" w:hAnsi="Aptos"/>
-                <w:b w:val="0"/>
-                <w:color w:val="172033"/>
-                <w:sz w:val="15"/>
-              </w:rPr>
-              <w:t>Buku Besar</w:t>
-            </w:r>
-          </w:p>
-        </w:tc>
-        <w:tc>
-          <w:tcPr>
-            <w:tcW w:type="dxa" w:w="1134"/>
-            <w:vAlign w:val="center"/>
-            <w:tcMar>
-              <w:top w:w="80" w:type="dxa"/>
-              <w:start w:w="100" w:type="dxa"/>
-              <w:bottom w:w="80" w:type="dxa"/>
-              <w:end w:w="100" w:type="dxa"/>
-            </w:tcMar>
-          </w:tcPr>
-          <w:p>
-            <w:pPr>
-              <w:spacing w:after="0"/>
-            </w:pPr>
-            <w:r/>
-            <w:r>
-              <w:rPr>
-                <w:rFonts w:ascii="Aptos" w:hAnsi="Aptos"/>
-                <w:b w:val="0"/>
-                <w:color w:val="172033"/>
-                <w:sz w:val="15"/>
-              </w:rPr>
-              <w:t>6</w:t>
-            </w:r>
-          </w:p>
-        </w:tc>
-        <w:tc>
-          <w:tcPr>
-            <w:tcW w:type="dxa" w:w="1134"/>
-            <w:vAlign w:val="center"/>
-            <w:tcMar>
-              <w:top w:w="80" w:type="dxa"/>
-              <w:start w:w="100" w:type="dxa"/>
-              <w:bottom w:w="80" w:type="dxa"/>
-              <w:end w:w="100" w:type="dxa"/>
-            </w:tcMar>
-          </w:tcPr>
-          <w:p>
-            <w:pPr>
-              <w:spacing w:after="0"/>
-            </w:pPr>
-            <w:r/>
-            <w:r>
-              <w:rPr>
-                <w:rFonts w:ascii="Aptos" w:hAnsi="Aptos"/>
-                <w:b w:val="0"/>
-                <w:color w:val="172033"/>
-                <w:sz w:val="15"/>
-              </w:rPr>
-              <w:t>4</w:t>
-            </w:r>
-          </w:p>
-        </w:tc>
-        <w:tc>
-          <w:tcPr>
-            <w:tcW w:type="dxa" w:w="2041"/>
-            <w:vAlign w:val="center"/>
-            <w:tcMar>
-              <w:top w:w="80" w:type="dxa"/>
-              <w:start w:w="100" w:type="dxa"/>
-              <w:bottom w:w="80" w:type="dxa"/>
-              <w:end w:w="100" w:type="dxa"/>
-            </w:tcMar>
-          </w:tcPr>
-          <w:p>
-            <w:pPr>
-              <w:spacing w:after="0"/>
-            </w:pPr>
-            <w:r/>
-            <w:r>
-              <w:rPr>
-                <w:rFonts w:ascii="Aptos" w:hAnsi="Aptos"/>
-                <w:b w:val="0"/>
-                <w:color w:val="172033"/>
-                <w:sz w:val="15"/>
-              </w:rPr>
-              <w:t>Sukses</w:t>
-            </w:r>
-          </w:p>
-        </w:tc>
-      </w:tr>
-      <w:tr>
-        <w:tc>
-          <w:tcPr>
-            <w:tcW w:type="dxa" w:w="5102"/>
-            <w:shd w:fill="F3F6FA"/>
+            <w:tcW w:type="dxa" w:w="2423"/>
             <w:vAlign w:val="center"/>
             <w:tcMar>
               <w:top w:w="80" w:type="dxa"/>
@@ -8843,8 +8565,7 @@
         </w:tc>
         <w:tc>
           <w:tcPr>
-            <w:tcW w:type="dxa" w:w="1134"/>
-            <w:shd w:fill="F3F6FA"/>
+            <w:tcW w:type="dxa" w:w="5522"/>
             <w:vAlign w:val="center"/>
             <w:tcMar>
               <w:top w:w="80" w:type="dxa"/>
@@ -8865,152 +8586,13 @@
                 <w:color w:val="172033"/>
                 <w:sz w:val="15"/>
               </w:rPr>
-              <w:t>4</w:t>
+              <w:t>Kas, piutang, persediaan, penyisihan, sewa, dan akun lain memiliki saldo.</w:t>
             </w:r>
           </w:p>
         </w:tc>
         <w:tc>
           <w:tcPr>
-            <w:tcW w:type="dxa" w:w="1134"/>
-            <w:shd w:fill="F3F6FA"/>
-            <w:vAlign w:val="center"/>
-            <w:tcMar>
-              <w:top w:w="80" w:type="dxa"/>
-              <w:start w:w="100" w:type="dxa"/>
-              <w:bottom w:w="80" w:type="dxa"/>
-              <w:end w:w="100" w:type="dxa"/>
-            </w:tcMar>
-          </w:tcPr>
-          <w:p>
-            <w:pPr>
-              <w:spacing w:after="0"/>
-            </w:pPr>
-            <w:r/>
-            <w:r>
-              <w:rPr>
-                <w:rFonts w:ascii="Aptos" w:hAnsi="Aptos"/>
-                <w:b w:val="0"/>
-                <w:color w:val="172033"/>
-                <w:sz w:val="15"/>
-              </w:rPr>
-              <w:t>3</w:t>
-            </w:r>
-          </w:p>
-        </w:tc>
-        <w:tc>
-          <w:tcPr>
-            <w:tcW w:type="dxa" w:w="2041"/>
-            <w:shd w:fill="F3F6FA"/>
-            <w:vAlign w:val="center"/>
-            <w:tcMar>
-              <w:top w:w="80" w:type="dxa"/>
-              <w:start w:w="100" w:type="dxa"/>
-              <w:bottom w:w="80" w:type="dxa"/>
-              <w:end w:w="100" w:type="dxa"/>
-            </w:tcMar>
-          </w:tcPr>
-          <w:p>
-            <w:pPr>
-              <w:spacing w:after="0"/>
-            </w:pPr>
-            <w:r/>
-            <w:r>
-              <w:rPr>
-                <w:rFonts w:ascii="Aptos" w:hAnsi="Aptos"/>
-                <w:b w:val="0"/>
-                <w:color w:val="172033"/>
-                <w:sz w:val="15"/>
-              </w:rPr>
-              <w:t>Sukses</w:t>
-            </w:r>
-          </w:p>
-        </w:tc>
-      </w:tr>
-      <w:tr>
-        <w:tc>
-          <w:tcPr>
-            <w:tcW w:type="dxa" w:w="5102"/>
-            <w:vAlign w:val="center"/>
-            <w:tcMar>
-              <w:top w:w="80" w:type="dxa"/>
-              <w:start w:w="100" w:type="dxa"/>
-              <w:bottom w:w="80" w:type="dxa"/>
-              <w:end w:w="100" w:type="dxa"/>
-            </w:tcMar>
-          </w:tcPr>
-          <w:p>
-            <w:pPr>
-              <w:spacing w:after="0"/>
-            </w:pPr>
-            <w:r/>
-            <w:r>
-              <w:rPr>
-                <w:rFonts w:ascii="Aptos" w:hAnsi="Aptos"/>
-                <w:b w:val="0"/>
-                <w:color w:val="172033"/>
-                <w:sz w:val="15"/>
-              </w:rPr>
-              <w:t>Neraca Percobaan Lengkap</w:t>
-            </w:r>
-          </w:p>
-        </w:tc>
-        <w:tc>
-          <w:tcPr>
-            <w:tcW w:type="dxa" w:w="1134"/>
-            <w:vAlign w:val="center"/>
-            <w:tcMar>
-              <w:top w:w="80" w:type="dxa"/>
-              <w:start w:w="100" w:type="dxa"/>
-              <w:bottom w:w="80" w:type="dxa"/>
-              <w:end w:w="100" w:type="dxa"/>
-            </w:tcMar>
-          </w:tcPr>
-          <w:p>
-            <w:pPr>
-              <w:spacing w:after="0"/>
-            </w:pPr>
-            <w:r/>
-            <w:r>
-              <w:rPr>
-                <w:rFonts w:ascii="Aptos" w:hAnsi="Aptos"/>
-                <w:b w:val="0"/>
-                <w:color w:val="172033"/>
-                <w:sz w:val="15"/>
-              </w:rPr>
-              <w:t>10</w:t>
-            </w:r>
-          </w:p>
-        </w:tc>
-        <w:tc>
-          <w:tcPr>
-            <w:tcW w:type="dxa" w:w="1134"/>
-            <w:vAlign w:val="center"/>
-            <w:tcMar>
-              <w:top w:w="80" w:type="dxa"/>
-              <w:start w:w="100" w:type="dxa"/>
-              <w:bottom w:w="80" w:type="dxa"/>
-              <w:end w:w="100" w:type="dxa"/>
-            </w:tcMar>
-          </w:tcPr>
-          <w:p>
-            <w:pPr>
-              <w:spacing w:after="0"/>
-            </w:pPr>
-            <w:r/>
-            <w:r>
-              <w:rPr>
-                <w:rFonts w:ascii="Aptos" w:hAnsi="Aptos"/>
-                <w:b w:val="0"/>
-                <w:color w:val="172033"/>
-                <w:sz w:val="15"/>
-              </w:rPr>
-              <w:t>5</w:t>
-            </w:r>
-          </w:p>
-        </w:tc>
-        <w:tc>
-          <w:tcPr>
-            <w:tcW w:type="dxa" w:w="2041"/>
+            <w:tcW w:type="dxa" w:w="1409"/>
             <w:vAlign w:val="center"/>
             <w:tcMar>
               <w:top w:w="80" w:type="dxa"/>
@@ -9100,7 +8682,7 @@
                 <w:color w:val="172033"/>
                 <w:sz w:val="17"/>
               </w:rPr>
-              <w:t>Jumlah baris bukan ukuran kelengkapan bisnis; ia mencerminkan data terposting pada periode dan unit terpilih.</w:t>
+              <w:t>Pemetaan Kelompok Laporan tidak mengubah saldo atau jurnal; ia menentukan tempat akun disajikan pada laporan resmi.</w:t>
             </w:r>
           </w:p>
         </w:tc>
@@ -9126,7 +8708,7 @@
     </w:p>
     <w:p>
       <w:r>
-        <w:t>Atur periode 1–4 September 2026 dan pilih Semua Unit/Konsolidasi bila diperlukan, lalu klik Tampilkan.</w:t>
+        <w:t>Atur periode 1–30 September 2026 dan pilih Semua Unit/Konsolidasi bila diperlukan, lalu klik Tampilkan.</w:t>
       </w:r>
     </w:p>
     <w:p>
@@ -9311,7 +8893,7 @@
                 <w:color w:val="172033"/>
                 <w:sz w:val="17"/>
               </w:rPr>
-              <w:t>Endpoint sukses; hasil tidak memiliki pendapatan/beban karena jurnal sample hanya memakai akun neraca.</w:t>
+              <w:t>Pendapatan penjualan sampel Rp4.750.000 tampil setelah akun 410.900 dipetakan. Beban sampel mencakup HPP, listrik/internet, sewa outlet, dan cadangan kerugian piutang.</w:t>
             </w:r>
           </w:p>
         </w:tc>
@@ -9337,7 +8919,7 @@
     </w:p>
     <w:p>
       <w:r>
-        <w:t>Atur periode 1–4 September 2026 dan pilih Semua Unit/Konsolidasi bila diperlukan, lalu klik Tampilkan.</w:t>
+        <w:t>Atur periode 1–30 September 2026 dan pilih Semua Unit/Konsolidasi bila diperlukan, lalu klik Tampilkan.</w:t>
       </w:r>
     </w:p>
     <w:p>
@@ -9522,7 +9104,7 @@
                 <w:color w:val="172033"/>
                 <w:sz w:val="17"/>
               </w:rPr>
-              <w:t>Saldo akun Kas, Kas Kecil, dan Modal tampil; sebagian akun masih berlabel belum dipetakan ke Kelompok Laporan.</w:t>
+              <w:t>Kas Yayasan Rp18.025.000 serta akun neraca lain tampil pada kelompok yang sesuai; label 'belum dipetakan' tidak lagi mendominasi hasil.</w:t>
             </w:r>
           </w:p>
         </w:tc>
@@ -9548,7 +9130,7 @@
     </w:p>
     <w:p>
       <w:r>
-        <w:t>Atur periode 1–4 September 2026 dan pilih Semua Unit/Konsolidasi bila diperlukan, lalu klik Tampilkan.</w:t>
+        <w:t>Atur periode 1–30 September 2026 dan pilih Semua Unit/Konsolidasi bila diperlukan, lalu klik Tampilkan.</w:t>
       </w:r>
     </w:p>
     <w:p>
@@ -9733,7 +9315,7 @@
                 <w:color w:val="172033"/>
                 <w:sz w:val="17"/>
               </w:rPr>
-              <w:t>Setoran modal Rp1.000.000 terbaca sebagai penerimaan; transfer antar-kas tidak menggandakan total penerimaan.</w:t>
+              <w:t>Saldo awal Kas &amp; Bank Rp12.900.000 dan penerimaan Rp3.100.000 terlihat; akun lawan memudahkan penelusuran sumber arus.</w:t>
             </w:r>
           </w:p>
         </w:tc>
@@ -9759,7 +9341,7 @@
     </w:p>
     <w:p>
       <w:r>
-        <w:t>Atur periode 1–4 September 2026 dan pilih Semua Unit/Konsolidasi bila diperlukan, lalu klik Tampilkan.</w:t>
+        <w:t>Atur periode 1–30 September 2026 dan pilih Semua Unit/Konsolidasi bila diperlukan, lalu klik Tampilkan.</w:t>
       </w:r>
     </w:p>
     <w:p>
@@ -9944,7 +9526,7 @@
                 <w:color w:val="172033"/>
                 <w:sz w:val="17"/>
               </w:rPr>
-              <w:t>Empat baris dari dua jurnal tampil dengan total Debet dan Kredit Rp1.250.000.</w:t>
+              <w:t>Delapan jurnal manual terposting dapat ditelusuri, termasuk penjualan tunai/kredit, HPP, listrik, sewa, dan penyisihan.</w:t>
             </w:r>
           </w:p>
         </w:tc>
@@ -9970,7 +9552,7 @@
     </w:p>
     <w:p>
       <w:r>
-        <w:t>Atur periode 1–4 September 2026 dan pilih Semua Unit/Konsolidasi bila diperlukan, lalu klik Tampilkan.</w:t>
+        <w:t>Atur periode 1–30 September 2026 dan pilih Semua Unit/Konsolidasi bila diperlukan, lalu klik Tampilkan.</w:t>
       </w:r>
     </w:p>
     <w:p>
@@ -10155,7 +9737,7 @@
                 <w:color w:val="172033"/>
                 <w:sz w:val="17"/>
               </w:rPr>
-              <w:t>Mutasi per akun dapat ditelusuri kembali ke JU/09/00001 dan JU/09/00002.</w:t>
+              <w:t>Mutasi Kas Yayasan dapat ditelusuri ke setoran modal, pemindahan kas, penjualan tunai, dan pembayaran biaya.</w:t>
             </w:r>
           </w:p>
         </w:tc>
@@ -10181,7 +9763,7 @@
     </w:p>
     <w:p>
       <w:r>
-        <w:t>Atur periode 1–4 September 2026 dan pilih Semua Unit/Konsolidasi bila diperlukan, lalu klik Tampilkan.</w:t>
+        <w:t>Atur periode 1–30 September 2026 dan pilih Semua Unit/Konsolidasi bila diperlukan, lalu klik Tampilkan.</w:t>
       </w:r>
     </w:p>
     <w:p>
@@ -10366,7 +9948,7 @@
                 <w:color w:val="172033"/>
                 <w:sz w:val="17"/>
               </w:rPr>
-              <w:t>Saldo akhir seimbang: total Debet Rp1.000.000 sama dengan total Kredit Rp1.000.000.</w:t>
+              <w:t>Saldo akun sampel tampil, antara lain Kas Rp3.375.000, Piutang Usaha Rp1.075.000, Cadangan Kerugian Piutang Rp200.000 (kredit), dan Persediaan Rp2.100.000 (kredit) untuk periode yang dipilih.</w:t>
             </w:r>
           </w:p>
         </w:tc>
@@ -10398,10 +9980,10 @@
         <w:tblLook w:firstColumn="1" w:firstRow="1" w:lastColumn="0" w:lastRow="0" w:noHBand="0" w:noVBand="1" w:val="04A0"/>
       </w:tblPr>
       <w:tblGrid>
-        <w:gridCol w:w="1134"/>
-        <w:gridCol w:w="1247"/>
-        <w:gridCol w:w="3515"/>
-        <w:gridCol w:w="3515"/>
+        <w:gridCol w:w="1127"/>
+        <w:gridCol w:w="1240"/>
+        <w:gridCol w:w="3494"/>
+        <w:gridCol w:w="3494"/>
       </w:tblGrid>
       <w:tr>
         <w:trPr>
@@ -10409,7 +9991,7 @@
         </w:trPr>
         <w:tc>
           <w:tcPr>
-            <w:tcW w:type="dxa" w:w="2509"/>
+            <w:tcW w:type="dxa" w:w="1127"/>
             <w:shd w:fill="132238"/>
             <w:vAlign w:val="center"/>
             <w:tcMar>
@@ -10437,7 +10019,7 @@
         </w:tc>
         <w:tc>
           <w:tcPr>
-            <w:tcW w:type="dxa" w:w="2509"/>
+            <w:tcW w:type="dxa" w:w="1240"/>
             <w:shd w:fill="132238"/>
             <w:vAlign w:val="center"/>
             <w:tcMar>
@@ -10465,7 +10047,7 @@
         </w:tc>
         <w:tc>
           <w:tcPr>
-            <w:tcW w:type="dxa" w:w="2509"/>
+            <w:tcW w:type="dxa" w:w="3494"/>
             <w:shd w:fill="132238"/>
             <w:vAlign w:val="center"/>
             <w:tcMar>
@@ -10493,7 +10075,7 @@
         </w:tc>
         <w:tc>
           <w:tcPr>
-            <w:tcW w:type="dxa" w:w="2509"/>
+            <w:tcW w:type="dxa" w:w="3494"/>
             <w:shd w:fill="132238"/>
             <w:vAlign w:val="center"/>
             <w:tcMar>
@@ -10523,7 +10105,7 @@
       <w:tr>
         <w:tc>
           <w:tcPr>
-            <w:tcW w:type="dxa" w:w="1134"/>
+            <w:tcW w:type="dxa" w:w="1127"/>
             <w:shd w:fill="F3F6FA"/>
             <w:vAlign w:val="center"/>
             <w:tcMar>
@@ -10551,7 +10133,7 @@
         </w:tc>
         <w:tc>
           <w:tcPr>
-            <w:tcW w:type="dxa" w:w="1247"/>
+            <w:tcW w:type="dxa" w:w="1240"/>
             <w:shd w:fill="F3F6FA"/>
             <w:vAlign w:val="center"/>
             <w:tcMar>
@@ -10579,7 +10161,7 @@
         </w:tc>
         <w:tc>
           <w:tcPr>
-            <w:tcW w:type="dxa" w:w="3515"/>
+            <w:tcW w:type="dxa" w:w="3494"/>
             <w:shd w:fill="F3F6FA"/>
             <w:vAlign w:val="center"/>
             <w:tcMar>
@@ -10601,13 +10183,13 @@
                 <w:color w:val="172033"/>
                 <w:sz w:val="14"/>
               </w:rPr>
-              <w:t>Posting HPP/Penjualan tertahan karena akun HPP dan persediaan produk sample belum diatur.</w:t>
+              <w:t>Posting HPP dan Kulakan tertahan karena Master Aset produk belum menyediakan akun Persediaan.</w:t>
             </w:r>
           </w:p>
         </w:tc>
         <w:tc>
           <w:tcPr>
-            <w:tcW w:type="dxa" w:w="3515"/>
+            <w:tcW w:type="dxa" w:w="3494"/>
             <w:shd w:fill="F3F6FA"/>
             <w:vAlign w:val="center"/>
             <w:tcMar>
@@ -10629,7 +10211,7 @@
                 <w:color w:val="172033"/>
                 <w:sz w:val="14"/>
               </w:rPr>
-              <w:t>Lengkapi pemetaan akun produk/kelompok, lalu ulang pratinjau dan posting.</w:t>
+              <w:t>Lengkapi akun Persediaan pada Master/Kelompok Aset yang benar, lalu ulang pratinjau sebelum posting.</w:t>
             </w:r>
           </w:p>
         </w:tc>
@@ -10637,7 +10219,7 @@
       <w:tr>
         <w:tc>
           <w:tcPr>
-            <w:tcW w:type="dxa" w:w="1134"/>
+            <w:tcW w:type="dxa" w:w="1127"/>
             <w:vAlign w:val="center"/>
             <w:tcMar>
               <w:top w:w="80" w:type="dxa"/>
@@ -10664,7 +10246,7 @@
         </w:tc>
         <w:tc>
           <w:tcPr>
-            <w:tcW w:type="dxa" w:w="1247"/>
+            <w:tcW w:type="dxa" w:w="1240"/>
             <w:vAlign w:val="center"/>
             <w:tcMar>
               <w:top w:w="80" w:type="dxa"/>
@@ -10685,13 +10267,13 @@
                 <w:color w:val="172033"/>
                 <w:sz w:val="14"/>
               </w:rPr>
-              <w:t>Sedang</w:t>
+              <w:t>Tinggi</w:t>
             </w:r>
           </w:p>
         </w:tc>
         <w:tc>
           <w:tcPr>
-            <w:tcW w:type="dxa" w:w="3515"/>
+            <w:tcW w:type="dxa" w:w="3494"/>
             <w:vAlign w:val="center"/>
             <w:tcMar>
               <w:top w:w="80" w:type="dxa"/>
@@ -10712,13 +10294,13 @@
                 <w:color w:val="172033"/>
                 <w:sz w:val="14"/>
               </w:rPr>
-              <w:t>Submenu yang berbagi layar bertab dapat mempertahankan tab dari submenu sebelumnya.</w:t>
+              <w:t>Posting Penjualan dapat mempertahankan isi pratinjau HPP setelah perpindahan submenu.</w:t>
             </w:r>
           </w:p>
         </w:tc>
         <w:tc>
           <w:tcPr>
-            <w:tcW w:type="dxa" w:w="3515"/>
+            <w:tcW w:type="dxa" w:w="3494"/>
             <w:vAlign w:val="center"/>
             <w:tcMar>
               <w:top w:w="80" w:type="dxa"/>
@@ -10739,7 +10321,7 @@
                 <w:color w:val="172033"/>
                 <w:sz w:val="14"/>
               </w:rPr>
-              <w:t>Tangani didUpdateWidget atau beri key unik agar tabAwal diterapkan saat submenu berubah.</w:t>
+              <w:t>Reset state pada didUpdateWidget atau gunakan key unik; blokir posting bila jenis layar dan payload berbeda.</w:t>
             </w:r>
           </w:p>
         </w:tc>
@@ -10747,7 +10329,7 @@
       <w:tr>
         <w:tc>
           <w:tcPr>
-            <w:tcW w:type="dxa" w:w="1134"/>
+            <w:tcW w:type="dxa" w:w="1127"/>
             <w:shd w:fill="F3F6FA"/>
             <w:vAlign w:val="center"/>
             <w:tcMar>
@@ -10775,7 +10357,7 @@
         </w:tc>
         <w:tc>
           <w:tcPr>
-            <w:tcW w:type="dxa" w:w="1247"/>
+            <w:tcW w:type="dxa" w:w="1240"/>
             <w:shd w:fill="F3F6FA"/>
             <w:vAlign w:val="center"/>
             <w:tcMar>
@@ -10803,8 +10385,119 @@
         </w:tc>
         <w:tc>
           <w:tcPr>
-            <w:tcW w:type="dxa" w:w="3515"/>
+            <w:tcW w:type="dxa" w:w="3494"/>
             <w:shd w:fill="F3F6FA"/>
+            <w:vAlign w:val="center"/>
+            <w:tcMar>
+              <w:top w:w="80" w:type="dxa"/>
+              <w:start w:w="100" w:type="dxa"/>
+              <w:bottom w:w="80" w:type="dxa"/>
+              <w:end w:w="100" w:type="dxa"/>
+            </w:tcMar>
+          </w:tcPr>
+          <w:p>
+            <w:pPr>
+              <w:spacing w:after="0"/>
+            </w:pPr>
+            <w:r/>
+            <w:r>
+              <w:rPr>
+                <w:rFonts w:ascii="Aptos" w:hAnsi="Aptos"/>
+                <w:b w:val="0"/>
+                <w:color w:val="172033"/>
+                <w:sz w:val="14"/>
+              </w:rPr>
+              <w:t>Tutup Buku menyatakan akun Laba Ditahan belum diatur walau akun sudah tersimpan pada toko.</w:t>
+            </w:r>
+          </w:p>
+        </w:tc>
+        <w:tc>
+          <w:tcPr>
+            <w:tcW w:type="dxa" w:w="3494"/>
+            <w:shd w:fill="F3F6FA"/>
+            <w:vAlign w:val="center"/>
+            <w:tcMar>
+              <w:top w:w="80" w:type="dxa"/>
+              <w:start w:w="100" w:type="dxa"/>
+              <w:bottom w:w="80" w:type="dxa"/>
+              <w:end w:w="100" w:type="dxa"/>
+            </w:tcMar>
+          </w:tcPr>
+          <w:p>
+            <w:pPr>
+              <w:spacing w:after="0"/>
+            </w:pPr>
+            <w:r/>
+            <w:r>
+              <w:rPr>
+                <w:rFonts w:ascii="Aptos" w:hAnsi="Aptos"/>
+                <w:b w:val="0"/>
+                <w:color w:val="172033"/>
+                <w:sz w:val="14"/>
+              </w:rPr>
+              <w:t>Pastikan tokoId/konteks toko ikut dikirim saat pratinjau dan gunakan pemetaan toko aktif.</w:t>
+            </w:r>
+          </w:p>
+        </w:tc>
+      </w:tr>
+      <w:tr>
+        <w:tc>
+          <w:tcPr>
+            <w:tcW w:type="dxa" w:w="1127"/>
+            <w:vAlign w:val="center"/>
+            <w:tcMar>
+              <w:top w:w="80" w:type="dxa"/>
+              <w:start w:w="100" w:type="dxa"/>
+              <w:bottom w:w="80" w:type="dxa"/>
+              <w:end w:w="100" w:type="dxa"/>
+            </w:tcMar>
+          </w:tcPr>
+          <w:p>
+            <w:pPr>
+              <w:spacing w:after="0"/>
+            </w:pPr>
+            <w:r/>
+            <w:r>
+              <w:rPr>
+                <w:rFonts w:ascii="Aptos" w:hAnsi="Aptos"/>
+                <w:b w:val="0"/>
+                <w:color w:val="172033"/>
+                <w:sz w:val="14"/>
+              </w:rPr>
+              <w:t>ACC-04</w:t>
+            </w:r>
+          </w:p>
+        </w:tc>
+        <w:tc>
+          <w:tcPr>
+            <w:tcW w:type="dxa" w:w="1240"/>
+            <w:vAlign w:val="center"/>
+            <w:tcMar>
+              <w:top w:w="80" w:type="dxa"/>
+              <w:start w:w="100" w:type="dxa"/>
+              <w:bottom w:w="80" w:type="dxa"/>
+              <w:end w:w="100" w:type="dxa"/>
+            </w:tcMar>
+          </w:tcPr>
+          <w:p>
+            <w:pPr>
+              <w:spacing w:after="0"/>
+            </w:pPr>
+            <w:r/>
+            <w:r>
+              <w:rPr>
+                <w:rFonts w:ascii="Aptos" w:hAnsi="Aptos"/>
+                <w:b w:val="0"/>
+                <w:color w:val="172033"/>
+                <w:sz w:val="14"/>
+              </w:rPr>
+              <w:t>Sedang</w:t>
+            </w:r>
+          </w:p>
+        </w:tc>
+        <w:tc>
+          <w:tcPr>
+            <w:tcW w:type="dxa" w:w="3494"/>
             <w:vAlign w:val="center"/>
             <w:tcMar>
               <w:top w:w="80" w:type="dxa"/>
@@ -10831,8 +10524,7 @@
         </w:tc>
         <w:tc>
           <w:tcPr>
-            <w:tcW w:type="dxa" w:w="3515"/>
-            <w:shd w:fill="F3F6FA"/>
+            <w:tcW w:type="dxa" w:w="3494"/>
             <w:vAlign w:val="center"/>
             <w:tcMar>
               <w:top w:w="80" w:type="dxa"/>
@@ -10861,7 +10553,8 @@
       <w:tr>
         <w:tc>
           <w:tcPr>
-            <w:tcW w:type="dxa" w:w="1134"/>
+            <w:tcW w:type="dxa" w:w="1127"/>
+            <w:shd w:fill="F3F6FA"/>
             <w:vAlign w:val="center"/>
             <w:tcMar>
               <w:top w:w="80" w:type="dxa"/>
@@ -10882,13 +10575,14 @@
                 <w:color w:val="172033"/>
                 <w:sz w:val="14"/>
               </w:rPr>
-              <w:t>ACC-04</w:t>
+              <w:t>API-01</w:t>
             </w:r>
           </w:p>
         </w:tc>
         <w:tc>
           <w:tcPr>
-            <w:tcW w:type="dxa" w:w="1247"/>
+            <w:tcW w:type="dxa" w:w="1240"/>
+            <w:shd w:fill="F3F6FA"/>
             <w:vAlign w:val="center"/>
             <w:tcMar>
               <w:top w:w="80" w:type="dxa"/>
@@ -10909,13 +10603,14 @@
                 <w:color w:val="172033"/>
                 <w:sz w:val="14"/>
               </w:rPr>
-              <w:t>Rendah</w:t>
+              <w:t>Tinggi</w:t>
             </w:r>
           </w:p>
         </w:tc>
         <w:tc>
           <w:tcPr>
-            <w:tcW w:type="dxa" w:w="3515"/>
+            <w:tcW w:type="dxa" w:w="3494"/>
+            <w:shd w:fill="F3F6FA"/>
             <w:vAlign w:val="center"/>
             <w:tcMar>
               <w:top w:w="80" w:type="dxa"/>
@@ -10936,13 +10631,14 @@
                 <w:color w:val="172033"/>
                 <w:sz w:val="14"/>
               </w:rPr>
-              <w:t>Kulakan, Bayar Hutang, Terima Piutang, Saldo Awal, Penyesuaian, dan Closing belum memiliki data sample periode uji.</w:t>
+              <w:t>Setelah restart, jurnal_umum_daftar mengembalikan SERVER_ERROR walau laporan jurnal tetap dapat memuat data.</w:t>
             </w:r>
           </w:p>
         </w:tc>
         <w:tc>
           <w:tcPr>
-            <w:tcW w:type="dxa" w:w="3515"/>
+            <w:tcW w:type="dxa" w:w="3494"/>
+            <w:shd w:fill="F3F6FA"/>
             <w:vAlign w:val="center"/>
             <w:tcMar>
               <w:top w:w="80" w:type="dxa"/>
@@ -10963,7 +10659,7 @@
                 <w:color w:val="172033"/>
                 <w:sz w:val="14"/>
               </w:rPr>
-              <w:t>Tambahkan dataset demo yang mencakup siklus penuh dan expected result.</w:t>
+              <w:t>Telusuri referensi API-MTLWU4YI dan uji endpoint daftar setelah perbaikan server.</w:t>
             </w:r>
           </w:p>
         </w:tc>
@@ -10971,8 +10667,7 @@
       <w:tr>
         <w:tc>
           <w:tcPr>
-            <w:tcW w:type="dxa" w:w="1134"/>
-            <w:shd w:fill="F3F6FA"/>
+            <w:tcW w:type="dxa" w:w="1127"/>
             <w:vAlign w:val="center"/>
             <w:tcMar>
               <w:top w:w="80" w:type="dxa"/>
@@ -10999,8 +10694,7 @@
         </w:tc>
         <w:tc>
           <w:tcPr>
-            <w:tcW w:type="dxa" w:w="1247"/>
-            <w:shd w:fill="F3F6FA"/>
+            <w:tcW w:type="dxa" w:w="1240"/>
             <w:vAlign w:val="center"/>
             <w:tcMar>
               <w:top w:w="80" w:type="dxa"/>
@@ -11027,8 +10721,7 @@
         </w:tc>
         <w:tc>
           <w:tcPr>
-            <w:tcW w:type="dxa" w:w="3515"/>
-            <w:shd w:fill="F3F6FA"/>
+            <w:tcW w:type="dxa" w:w="3494"/>
             <w:vAlign w:val="center"/>
             <w:tcMar>
               <w:top w:w="80" w:type="dxa"/>
@@ -11049,14 +10742,13 @@
                 <w:color w:val="172033"/>
                 <w:sz w:val="14"/>
               </w:rPr>
-              <w:t>Server publik sempat memberi 503 saat restart sehingga pengambilan laporan perlu diulang.</w:t>
+              <w:t>Server sempat direstart; data dan laporan kemudian diuji ulang setelah layanan aktif.</w:t>
             </w:r>
           </w:p>
         </w:tc>
         <w:tc>
           <w:tcPr>
-            <w:tcW w:type="dxa" w:w="3515"/>
-            <w:shd w:fill="F3F6FA"/>
+            <w:tcW w:type="dxa" w:w="3494"/>
             <w:vAlign w:val="center"/>
             <w:tcMar>
               <w:top w:w="80" w:type="dxa"/>
@@ -11077,7 +10769,7 @@
                 <w:color w:val="172033"/>
                 <w:sz w:val="14"/>
               </w:rPr>
-              <w:t>Jalankan UAT setelah health check API stabil dan catat window maintenance.</w:t>
+              <w:t>Jalankan health check API sebelum regression test dan catat window maintenance.</w:t>
             </w:r>
           </w:p>
         </w:tc>
@@ -11154,7 +10846,7 @@
                 <w:color w:val="172033"/>
                 <w:sz w:val="17"/>
               </w:rPr>
-              <w:t>Jurnal manual, posting jurnal, master data, dan laporan dapat dipakai. Posting otomatis perlu konfigurasi akun; Tutup Buku/Closing memerlukan UAT khusus pada salinan database.</w:t>
+              <w:t>Data master, saldo awal, penyesuaian, posting hutang/piutang, dan laporan dapat digunakan. Tahan Posting HPP/Penjualan/Kulakan dan Tutup Buku sampai ACC-01–ACC-03 serta API-01 diperbaiki; Closing final perlu UAT pada salinan database.</w:t>
             </w:r>
           </w:p>
         </w:tc>
@@ -11186,9 +10878,9 @@
         <w:tblLook w:firstColumn="1" w:firstRow="1" w:lastColumn="0" w:lastRow="0" w:noHBand="0" w:noVBand="1" w:val="04A0"/>
       </w:tblPr>
       <w:tblGrid>
-        <w:gridCol w:w="1814"/>
-        <w:gridCol w:w="6690"/>
-        <w:gridCol w:w="907"/>
+        <w:gridCol w:w="1803"/>
+        <w:gridCol w:w="6649"/>
+        <w:gridCol w:w="902"/>
       </w:tblGrid>
       <w:tr>
         <w:trPr>
@@ -11196,7 +10888,7 @@
         </w:trPr>
         <w:tc>
           <w:tcPr>
-            <w:tcW w:type="dxa" w:w="3345"/>
+            <w:tcW w:type="dxa" w:w="1803"/>
             <w:shd w:fill="132238"/>
             <w:vAlign w:val="center"/>
             <w:tcMar>
@@ -11224,7 +10916,7 @@
         </w:tc>
         <w:tc>
           <w:tcPr>
-            <w:tcW w:type="dxa" w:w="3345"/>
+            <w:tcW w:type="dxa" w:w="6649"/>
             <w:shd w:fill="132238"/>
             <w:vAlign w:val="center"/>
             <w:tcMar>
@@ -11252,7 +10944,7 @@
         </w:tc>
         <w:tc>
           <w:tcPr>
-            <w:tcW w:type="dxa" w:w="3345"/>
+            <w:tcW w:type="dxa" w:w="902"/>
             <w:shd w:fill="132238"/>
             <w:vAlign w:val="center"/>
             <w:tcMar>
@@ -11282,7 +10974,7 @@
       <w:tr>
         <w:tc>
           <w:tcPr>
-            <w:tcW w:type="dxa" w:w="1814"/>
+            <w:tcW w:type="dxa" w:w="1803"/>
             <w:shd w:fill="F3F6FA"/>
             <w:vAlign w:val="center"/>
             <w:tcMar>
@@ -11310,7 +11002,7 @@
         </w:tc>
         <w:tc>
           <w:tcPr>
-            <w:tcW w:type="dxa" w:w="6690"/>
+            <w:tcW w:type="dxa" w:w="6649"/>
             <w:shd w:fill="F3F6FA"/>
             <w:vAlign w:val="center"/>
             <w:tcMar>
@@ -11338,7 +11030,7 @@
         </w:tc>
         <w:tc>
           <w:tcPr>
-            <w:tcW w:type="dxa" w:w="907"/>
+            <w:tcW w:type="dxa" w:w="902"/>
             <w:shd w:fill="F3F6FA"/>
             <w:vAlign w:val="center"/>
             <w:tcMar>
@@ -11368,7 +11060,7 @@
       <w:tr>
         <w:tc>
           <w:tcPr>
-            <w:tcW w:type="dxa" w:w="1814"/>
+            <w:tcW w:type="dxa" w:w="1803"/>
             <w:vAlign w:val="center"/>
             <w:tcMar>
               <w:top w:w="80" w:type="dxa"/>
@@ -11395,7 +11087,7 @@
         </w:tc>
         <w:tc>
           <w:tcPr>
-            <w:tcW w:type="dxa" w:w="6690"/>
+            <w:tcW w:type="dxa" w:w="6649"/>
             <w:vAlign w:val="center"/>
             <w:tcMar>
               <w:top w:w="80" w:type="dxa"/>
@@ -11422,7 +11114,7 @@
         </w:tc>
         <w:tc>
           <w:tcPr>
-            <w:tcW w:type="dxa" w:w="907"/>
+            <w:tcW w:type="dxa" w:w="902"/>
             <w:vAlign w:val="center"/>
             <w:tcMar>
               <w:top w:w="80" w:type="dxa"/>
@@ -11451,7 +11143,7 @@
       <w:tr>
         <w:tc>
           <w:tcPr>
-            <w:tcW w:type="dxa" w:w="1814"/>
+            <w:tcW w:type="dxa" w:w="1803"/>
             <w:shd w:fill="F3F6FA"/>
             <w:vAlign w:val="center"/>
             <w:tcMar>
@@ -11479,7 +11171,7 @@
         </w:tc>
         <w:tc>
           <w:tcPr>
-            <w:tcW w:type="dxa" w:w="6690"/>
+            <w:tcW w:type="dxa" w:w="6649"/>
             <w:shd w:fill="F3F6FA"/>
             <w:vAlign w:val="center"/>
             <w:tcMar>
@@ -11507,7 +11199,7 @@
         </w:tc>
         <w:tc>
           <w:tcPr>
-            <w:tcW w:type="dxa" w:w="907"/>
+            <w:tcW w:type="dxa" w:w="902"/>
             <w:shd w:fill="F3F6FA"/>
             <w:vAlign w:val="center"/>
             <w:tcMar>
@@ -11537,7 +11229,7 @@
       <w:tr>
         <w:tc>
           <w:tcPr>
-            <w:tcW w:type="dxa" w:w="1814"/>
+            <w:tcW w:type="dxa" w:w="1803"/>
             <w:vAlign w:val="center"/>
             <w:tcMar>
               <w:top w:w="80" w:type="dxa"/>
@@ -11564,7 +11256,7 @@
         </w:tc>
         <w:tc>
           <w:tcPr>
-            <w:tcW w:type="dxa" w:w="6690"/>
+            <w:tcW w:type="dxa" w:w="6649"/>
             <w:vAlign w:val="center"/>
             <w:tcMar>
               <w:top w:w="80" w:type="dxa"/>
@@ -11591,7 +11283,7 @@
         </w:tc>
         <w:tc>
           <w:tcPr>
-            <w:tcW w:type="dxa" w:w="907"/>
+            <w:tcW w:type="dxa" w:w="902"/>
             <w:vAlign w:val="center"/>
             <w:tcMar>
               <w:top w:w="80" w:type="dxa"/>
@@ -11620,7 +11312,7 @@
       <w:tr>
         <w:tc>
           <w:tcPr>
-            <w:tcW w:type="dxa" w:w="1814"/>
+            <w:tcW w:type="dxa" w:w="1803"/>
             <w:shd w:fill="F3F6FA"/>
             <w:vAlign w:val="center"/>
             <w:tcMar>
@@ -11648,7 +11340,7 @@
         </w:tc>
         <w:tc>
           <w:tcPr>
-            <w:tcW w:type="dxa" w:w="6690"/>
+            <w:tcW w:type="dxa" w:w="6649"/>
             <w:shd w:fill="F3F6FA"/>
             <w:vAlign w:val="center"/>
             <w:tcMar>
@@ -11676,7 +11368,7 @@
         </w:tc>
         <w:tc>
           <w:tcPr>
-            <w:tcW w:type="dxa" w:w="907"/>
+            <w:tcW w:type="dxa" w:w="902"/>
             <w:shd w:fill="F3F6FA"/>
             <w:vAlign w:val="center"/>
             <w:tcMar>
@@ -11706,7 +11398,7 @@
       <w:tr>
         <w:tc>
           <w:tcPr>
-            <w:tcW w:type="dxa" w:w="1814"/>
+            <w:tcW w:type="dxa" w:w="1803"/>
             <w:vAlign w:val="center"/>
             <w:tcMar>
               <w:top w:w="80" w:type="dxa"/>
@@ -11733,7 +11425,7 @@
         </w:tc>
         <w:tc>
           <w:tcPr>
-            <w:tcW w:type="dxa" w:w="6690"/>
+            <w:tcW w:type="dxa" w:w="6649"/>
             <w:vAlign w:val="center"/>
             <w:tcMar>
               <w:top w:w="80" w:type="dxa"/>
@@ -11760,7 +11452,7 @@
         </w:tc>
         <w:tc>
           <w:tcPr>
-            <w:tcW w:type="dxa" w:w="907"/>
+            <w:tcW w:type="dxa" w:w="902"/>
             <w:vAlign w:val="center"/>
             <w:tcMar>
               <w:top w:w="80" w:type="dxa"/>
@@ -11789,7 +11481,7 @@
       <w:tr>
         <w:tc>
           <w:tcPr>
-            <w:tcW w:type="dxa" w:w="1814"/>
+            <w:tcW w:type="dxa" w:w="1803"/>
             <w:shd w:fill="F3F6FA"/>
             <w:vAlign w:val="center"/>
             <w:tcMar>
@@ -11817,7 +11509,7 @@
         </w:tc>
         <w:tc>
           <w:tcPr>
-            <w:tcW w:type="dxa" w:w="6690"/>
+            <w:tcW w:type="dxa" w:w="6649"/>
             <w:shd w:fill="F3F6FA"/>
             <w:vAlign w:val="center"/>
             <w:tcMar>
@@ -11845,7 +11537,7 @@
         </w:tc>
         <w:tc>
           <w:tcPr>
-            <w:tcW w:type="dxa" w:w="907"/>
+            <w:tcW w:type="dxa" w:w="902"/>
             <w:shd w:fill="F3F6FA"/>
             <w:vAlign w:val="center"/>
             <w:tcMar>
@@ -11994,7 +11686,7 @@
                 <w:color w:val="172033"/>
                 <w:sz w:val="17"/>
               </w:rPr>
-              <w:t>Manual ini dibuat dari UAT server demo pada 4 September 2026. Ulangi smoke test setelah perbaikan ACC-01 sampai ACC-03.</w:t>
+              <w:t>Manual ini dibuat dari UAT server demo pada 4 September 2026 dan pengujian ulang setelah restart. Ulangi smoke test setelah perbaikan ACC-01 sampai ACC-04 dan API-01.</w:t>
             </w:r>
           </w:p>
         </w:tc>

</xml_diff>